<commit_message>
Update week 37 teaching materials
Refreshes the week 37 Scratch football assignment document and the Tuesday algorithms presentation. Also adds a timestamped backup copy of the presentation and includes newly generated macOS/Office metadata and temporary files.
</commit_message>
<xml_diff>
--- a/opgaver/Uge37Scratch_football (1).docx
+++ b/opgaver/Uge37Scratch_football (1).docx
@@ -1,22 +1,36 @@
 
 <file path=word/document.xml><?xml version="1.0" encoding="utf-8"?>
-<w:document xmlns:wpc="http://schemas.microsoft.com/office/word/2010/wordprocessingCanvas" xmlns:cx="http://schemas.microsoft.com/office/drawing/2014/chartex" xmlns:cx1="http://schemas.microsoft.com/office/drawing/2015/9/8/chartex" xmlns:cx2="http://schemas.microsoft.com/office/drawing/2015/10/21/chartex" xmlns:cx3="http://schemas.microsoft.com/office/drawing/2016/5/9/chartex" xmlns:cx4="http://schemas.microsoft.com/office/drawing/2016/5/10/chartex" xmlns:cx5="http://schemas.microsoft.com/office/drawing/2016/5/11/chartex" xmlns:cx6="http://schemas.microsoft.com/office/drawing/2016/5/12/chartex" xmlns:cx7="http://schemas.microsoft.com/office/drawing/2016/5/13/chartex" xmlns:cx8="http://schemas.microsoft.com/office/drawing/2016/5/14/chartex" xmlns:mc="http://schemas.openxmlformats.org/markup-compatibility/2006" xmlns:aink="http://schemas.microsoft.com/office/drawing/2016/ink" xmlns:am3d="http://schemas.microsoft.com/office/drawing/2017/model3d" xmlns:o="urn:schemas-microsoft-com:office:office" xmlns:oel="http://schemas.microsoft.com/office/2019/extlst" xmlns:r="http://schemas.openxmlformats.org/officeDocument/2006/relationships" xmlns:m="http://schemas.openxmlformats.org/officeDocument/2006/math" xmlns:v="urn:schemas-microsoft-com:vml" xmlns:wp14="http://schemas.microsoft.com/office/word/2010/wordprocessingDrawing" xmlns:wp="http://schemas.openxmlformats.org/drawingml/2006/wordprocessingDrawing" xmlns:w10="urn:schemas-microsoft-com:office:word" xmlns:w="http://schemas.openxmlformats.org/wordprocessingml/2006/main" xmlns:w14="http://schemas.microsoft.com/office/word/2010/wordml" xmlns:w15="http://schemas.microsoft.com/office/word/2012/wordml" xmlns:w16cex="http://schemas.microsoft.com/office/word/2018/wordml/cex" xmlns:w16cid="http://schemas.microsoft.com/office/word/2016/wordml/cid" xmlns:w16="http://schemas.microsoft.com/office/word/2018/wordml" xmlns:w16du="http://schemas.microsoft.com/office/word/2023/wordml/word16du" xmlns:w16sdtdh="http://schemas.microsoft.com/office/word/2020/wordml/sdtdatahash" xmlns:w16sdtfl="http://schemas.microsoft.com/office/word/2024/wordml/sdtformatlock" xmlns:w16se="http://schemas.microsoft.com/office/word/2015/wordml/symex" xmlns:wpg="http://schemas.microsoft.com/office/word/2010/wordprocessingGroup" xmlns:wpi="http://schemas.microsoft.com/office/word/2010/wordprocessingInk" xmlns:wne="http://schemas.microsoft.com/office/word/2006/wordml" xmlns:wps="http://schemas.microsoft.com/office/word/2010/wordprocessingShape" xmlns:a="http://schemas.openxmlformats.org/drawingml/2006/main" xmlns:a16="http://schemas.microsoft.com/office/drawing/2014/main" xmlns:pic="http://schemas.openxmlformats.org/drawingml/2006/picture" xmlns:a14="http://schemas.microsoft.com/office/drawing/2010/main" mc:Ignorable="w14 w15 w16se w16cid w16 w16cex w16sdtdh w16sdtfl w16du wp14">
+<w:document xmlns:wpc="http://schemas.microsoft.com/office/word/2010/wordprocessingCanvas" xmlns:cx="http://schemas.microsoft.com/office/drawing/2014/chartex" xmlns:cx1="http://schemas.microsoft.com/office/drawing/2015/9/8/chartex" xmlns:cx2="http://schemas.microsoft.com/office/drawing/2015/10/21/chartex" xmlns:cx3="http://schemas.microsoft.com/office/drawing/2016/5/9/chartex" xmlns:cx4="http://schemas.microsoft.com/office/drawing/2016/5/10/chartex" xmlns:cx5="http://schemas.microsoft.com/office/drawing/2016/5/11/chartex" xmlns:cx6="http://schemas.microsoft.com/office/drawing/2016/5/12/chartex" xmlns:cx7="http://schemas.microsoft.com/office/drawing/2016/5/13/chartex" xmlns:cx8="http://schemas.microsoft.com/office/drawing/2016/5/14/chartex" xmlns:mc="http://schemas.openxmlformats.org/markup-compatibility/2006" xmlns:m="http://schemas.openxmlformats.org/officeDocument/2006/math" xmlns:aink="http://schemas.microsoft.com/office/drawing/2016/ink" xmlns:am3d="http://schemas.microsoft.com/office/drawing/2017/model3d" xmlns:oel="http://schemas.microsoft.com/office/2019/extlst" xmlns:r="http://schemas.openxmlformats.org/officeDocument/2006/relationships" xmlns:wp14="http://schemas.microsoft.com/office/word/2010/wordprocessingDrawing" xmlns:wp="http://schemas.openxmlformats.org/drawingml/2006/wordprocessingDrawing" xmlns:wpg="http://schemas.microsoft.com/office/word/2010/wordprocessingGroup" xmlns:wpi="http://schemas.microsoft.com/office/word/2010/wordprocessingInk" xmlns:wps="http://schemas.microsoft.com/office/word/2010/wordprocessingShape" xmlns:o="urn:schemas-microsoft-com:office:office" xmlns:v="urn:schemas-microsoft-com:vml" xmlns:w10="urn:schemas-microsoft-com:office:word" xmlns:w="http://schemas.openxmlformats.org/wordprocessingml/2006/main" xmlns:w14="http://schemas.microsoft.com/office/word/2010/wordml" xmlns:w15="http://schemas.microsoft.com/office/word/2012/wordml" xmlns:w16cex="http://schemas.microsoft.com/office/word/2018/wordml/cex" xmlns:w16cid="http://schemas.microsoft.com/office/word/2016/wordml/cid" xmlns:w16="http://schemas.microsoft.com/office/word/2018/wordml" xmlns:w16sdtdh="http://schemas.microsoft.com/office/word/2020/wordml/sdtdatahash" xmlns:w16sdtfl="http://schemas.microsoft.com/office/word/2024/wordml/sdtformatlock" xmlns:w16se="http://schemas.microsoft.com/office/word/2015/wordml/symex" xmlns:w16du="http://schemas.microsoft.com/office/word/2023/wordml/word16du" xmlns:wne="http://schemas.microsoft.com/office/word/2006/wordml" mc:Ignorable="w14 w15 w16se w16cid w16 w16cex w16sdtdh w16sdtfl w16du wp14">
   <w:body>
     <w:p>
       <w:pPr>
         <w:pStyle w:val="Heading1"/>
         <w:spacing w:before="480" w:after="0" w:line="276" w:lineRule="auto"/>
       </w:pPr>
-      <w:r>
-        <w:rPr>
-          <w:rFonts w:ascii="Calibri" w:hAnsi="Calibri" w:eastAsia="Calibri" w:cs="Calibri"/>
-          <w:b w:val="1"/>
-          <w:bCs w:val="1"/>
+      <w:proofErr w:type="spellStart"/>
+      <w:r>
+        <w:rPr>
+          <w:rFonts w:ascii="Calibri" w:eastAsia="Calibri" w:hAnsi="Calibri" w:cs="Calibri"/>
+          <w:b/>
+          <w:bCs/>
           <w:color w:val="365F91"/>
           <w:sz w:val="28"/>
           <w:szCs w:val="28"/>
-        </w:rPr>
-        <w:t>Challenge: Football bane</w:t>
+          <w:lang w:eastAsia="zh-CN"/>
+        </w:rPr>
+        <w:t>mandag</w:t>
+      </w:r>
+      <w:proofErr w:type="spellEnd"/>
+      <w:r>
+        <w:rPr>
+          <w:rFonts w:ascii="Calibri" w:eastAsia="Calibri" w:hAnsi="Calibri" w:cs="Calibri"/>
+          <w:b/>
+          <w:bCs/>
+          <w:color w:val="365F91"/>
+          <w:sz w:val="28"/>
+          <w:szCs w:val="28"/>
+        </w:rPr>
+        <w:t>: Football bane</w:t>
       </w:r>
     </w:p>
     <w:tbl>
@@ -24,10 +38,10 @@
         <w:tblW w:w="0" w:type="auto"/>
         <w:tblInd w:w="120" w:type="dxa"/>
         <w:tblBorders>
-          <w:top w:val="single" w:color="auto" w:sz="6" w:space="0"/>
-          <w:left w:val="single" w:color="auto" w:sz="6" w:space="0"/>
-          <w:bottom w:val="single" w:color="auto" w:sz="6" w:space="0"/>
-          <w:right w:val="single" w:color="auto" w:sz="6" w:space="0"/>
+          <w:top w:val="single" w:sz="6" w:space="0" w:color="auto"/>
+          <w:left w:val="single" w:sz="6" w:space="0" w:color="auto"/>
+          <w:bottom w:val="single" w:sz="6" w:space="0" w:color="auto"/>
+          <w:right w:val="single" w:sz="6" w:space="0" w:color="auto"/>
         </w:tblBorders>
         <w:tblLayout w:type="fixed"/>
         <w:tblLook w:val="04A0" w:firstRow="1" w:lastRow="0" w:firstColumn="1" w:lastColumn="0" w:noHBand="0" w:noVBand="1"/>
@@ -44,20 +58,23 @@
           <w:tcPr>
             <w:tcW w:w="3554" w:type="dxa"/>
             <w:tcBorders>
-              <w:top w:val="single" w:color="000000" w:themeColor="text1" w:sz="8" w:space="0"/>
-              <w:left w:val="single" w:color="000000" w:themeColor="text1" w:sz="8" w:space="0"/>
-              <w:bottom w:val="single" w:color="000000" w:themeColor="text1" w:sz="8" w:space="0"/>
-              <w:right w:val="single" w:color="000000" w:themeColor="text1" w:sz="8" w:space="0"/>
+              <w:top w:val="single" w:sz="8" w:space="0" w:color="000000" w:themeColor="text1"/>
+              <w:left w:val="single" w:sz="8" w:space="0" w:color="000000" w:themeColor="text1"/>
+              <w:bottom w:val="single" w:sz="8" w:space="0" w:color="000000" w:themeColor="text1"/>
+              <w:right w:val="single" w:sz="8" w:space="0" w:color="000000" w:themeColor="text1"/>
             </w:tcBorders>
           </w:tcPr>
           <w:p>
             <w:pPr>
               <w:spacing w:after="0"/>
               <w:ind w:left="105"/>
+              <w:rPr>
+                <w:lang w:val="da-DK"/>
+              </w:rPr>
             </w:pPr>
             <w:r>
               <w:rPr>
-                <w:rFonts w:ascii="Calibri" w:hAnsi="Calibri" w:eastAsia="Calibri" w:cs="Calibri"/>
+                <w:rFonts w:ascii="Calibri" w:eastAsia="Calibri" w:hAnsi="Calibri" w:cs="Calibri"/>
                 <w:b/>
                 <w:bCs/>
                 <w:sz w:val="28"/>
@@ -68,7 +85,7 @@
             </w:r>
             <w:r>
               <w:rPr>
-                <w:rFonts w:ascii="Calibri" w:hAnsi="Calibri" w:eastAsia="Calibri" w:cs="Calibri"/>
+                <w:rFonts w:ascii="Calibri" w:eastAsia="Calibri" w:hAnsi="Calibri" w:cs="Calibri"/>
                 <w:sz w:val="28"/>
                 <w:szCs w:val="28"/>
                 <w:lang w:val="da"/>
@@ -80,10 +97,13 @@
             <w:pPr>
               <w:spacing w:after="0"/>
               <w:ind w:left="105"/>
+              <w:rPr>
+                <w:lang w:val="da-DK"/>
+              </w:rPr>
             </w:pPr>
             <w:r>
               <w:rPr>
-                <w:rFonts w:ascii="Calibri" w:hAnsi="Calibri" w:eastAsia="Calibri" w:cs="Calibri"/>
+                <w:rFonts w:ascii="Calibri" w:eastAsia="Calibri" w:hAnsi="Calibri" w:cs="Calibri"/>
                 <w:sz w:val="28"/>
                 <w:szCs w:val="28"/>
                 <w:lang w:val="da"/>
@@ -96,20 +116,23 @@
           <w:tcPr>
             <w:tcW w:w="5529" w:type="dxa"/>
             <w:tcBorders>
-              <w:top w:val="single" w:color="000000" w:themeColor="text1" w:sz="8" w:space="0"/>
-              <w:left w:val="single" w:color="000000" w:themeColor="text1" w:sz="8" w:space="0"/>
-              <w:bottom w:val="single" w:color="000000" w:themeColor="text1" w:sz="8" w:space="0"/>
-              <w:right w:val="single" w:color="000000" w:themeColor="text1" w:sz="8" w:space="0"/>
+              <w:top w:val="single" w:sz="8" w:space="0" w:color="000000" w:themeColor="text1"/>
+              <w:left w:val="single" w:sz="8" w:space="0" w:color="000000" w:themeColor="text1"/>
+              <w:bottom w:val="single" w:sz="8" w:space="0" w:color="000000" w:themeColor="text1"/>
+              <w:right w:val="single" w:sz="8" w:space="0" w:color="000000" w:themeColor="text1"/>
             </w:tcBorders>
           </w:tcPr>
           <w:p>
             <w:pPr>
               <w:spacing w:after="0"/>
               <w:ind w:left="105"/>
+              <w:rPr>
+                <w:lang w:val="da-DK"/>
+              </w:rPr>
             </w:pPr>
             <w:r>
               <w:rPr>
-                <w:rFonts w:ascii="Calibri" w:hAnsi="Calibri" w:eastAsia="Calibri" w:cs="Calibri"/>
+                <w:rFonts w:ascii="Calibri" w:eastAsia="Calibri" w:hAnsi="Calibri" w:cs="Calibri"/>
                 <w:b/>
                 <w:bCs/>
                 <w:sz w:val="28"/>
@@ -120,7 +143,7 @@
             </w:r>
             <w:r>
               <w:rPr>
-                <w:rFonts w:ascii="Calibri" w:hAnsi="Calibri" w:eastAsia="Calibri" w:cs="Calibri"/>
+                <w:rFonts w:ascii="Calibri" w:eastAsia="Calibri" w:hAnsi="Calibri" w:cs="Calibri"/>
                 <w:sz w:val="28"/>
                 <w:szCs w:val="28"/>
                 <w:lang w:val="da"/>
@@ -138,20 +161,23 @@
           <w:tcPr>
             <w:tcW w:w="3554" w:type="dxa"/>
             <w:tcBorders>
-              <w:top w:val="single" w:color="000000" w:themeColor="text1" w:sz="8" w:space="0"/>
-              <w:left w:val="single" w:color="000000" w:themeColor="text1" w:sz="8" w:space="0"/>
-              <w:bottom w:val="single" w:color="000000" w:themeColor="text1" w:sz="8" w:space="0"/>
-              <w:right w:val="single" w:color="000000" w:themeColor="text1" w:sz="8" w:space="0"/>
+              <w:top w:val="single" w:sz="8" w:space="0" w:color="000000" w:themeColor="text1"/>
+              <w:left w:val="single" w:sz="8" w:space="0" w:color="000000" w:themeColor="text1"/>
+              <w:bottom w:val="single" w:sz="8" w:space="0" w:color="000000" w:themeColor="text1"/>
+              <w:right w:val="single" w:sz="8" w:space="0" w:color="000000" w:themeColor="text1"/>
             </w:tcBorders>
           </w:tcPr>
           <w:p>
             <w:pPr>
               <w:spacing w:after="0"/>
               <w:ind w:left="105" w:right="1200"/>
+              <w:rPr>
+                <w:lang w:val="da-DK"/>
+              </w:rPr>
             </w:pPr>
             <w:r>
               <w:rPr>
-                <w:rFonts w:ascii="Calibri" w:hAnsi="Calibri" w:eastAsia="Calibri" w:cs="Calibri"/>
+                <w:rFonts w:ascii="Calibri" w:eastAsia="Calibri" w:hAnsi="Calibri" w:cs="Calibri"/>
                 <w:sz w:val="28"/>
                 <w:szCs w:val="28"/>
                 <w:lang w:val="da"/>
@@ -164,20 +190,23 @@
           <w:tcPr>
             <w:tcW w:w="5529" w:type="dxa"/>
             <w:tcBorders>
-              <w:top w:val="single" w:color="000000" w:themeColor="text1" w:sz="8" w:space="0"/>
-              <w:left w:val="single" w:color="000000" w:themeColor="text1" w:sz="8" w:space="0"/>
-              <w:bottom w:val="single" w:color="000000" w:themeColor="text1" w:sz="8" w:space="0"/>
-              <w:right w:val="single" w:color="000000" w:themeColor="text1" w:sz="8" w:space="0"/>
+              <w:top w:val="single" w:sz="8" w:space="0" w:color="000000" w:themeColor="text1"/>
+              <w:left w:val="single" w:sz="8" w:space="0" w:color="000000" w:themeColor="text1"/>
+              <w:bottom w:val="single" w:sz="8" w:space="0" w:color="000000" w:themeColor="text1"/>
+              <w:right w:val="single" w:sz="8" w:space="0" w:color="000000" w:themeColor="text1"/>
             </w:tcBorders>
           </w:tcPr>
           <w:p>
             <w:pPr>
               <w:spacing w:after="0"/>
               <w:ind w:left="105"/>
+              <w:rPr>
+                <w:lang w:val="da-DK"/>
+              </w:rPr>
             </w:pPr>
             <w:r>
               <w:rPr>
-                <w:rFonts w:ascii="Calibri" w:hAnsi="Calibri" w:eastAsia="Calibri" w:cs="Calibri"/>
+                <w:rFonts w:ascii="Calibri" w:eastAsia="Calibri" w:hAnsi="Calibri" w:cs="Calibri"/>
                 <w:sz w:val="28"/>
                 <w:szCs w:val="28"/>
                 <w:lang w:val="da"/>
@@ -189,10 +218,13 @@
             <w:pPr>
               <w:spacing w:after="0"/>
               <w:ind w:left="105"/>
+              <w:rPr>
+                <w:lang w:val="da-DK"/>
+              </w:rPr>
             </w:pPr>
             <w:r>
               <w:rPr>
-                <w:rFonts w:ascii="Calibri" w:hAnsi="Calibri" w:eastAsia="Calibri" w:cs="Calibri"/>
+                <w:rFonts w:ascii="Calibri" w:eastAsia="Calibri" w:hAnsi="Calibri" w:cs="Calibri"/>
                 <w:sz w:val="28"/>
                 <w:szCs w:val="28"/>
                 <w:lang w:val="da"/>
@@ -203,10 +235,13 @@
           <w:p>
             <w:pPr>
               <w:spacing w:after="0"/>
+              <w:rPr>
+                <w:lang w:val="da-DK"/>
+              </w:rPr>
             </w:pPr>
             <w:r>
               <w:rPr>
-                <w:rFonts w:ascii="Calibri" w:hAnsi="Calibri" w:eastAsia="Calibri" w:cs="Calibri"/>
+                <w:rFonts w:ascii="Calibri" w:eastAsia="Calibri" w:hAnsi="Calibri" w:cs="Calibri"/>
                 <w:sz w:val="12"/>
                 <w:szCs w:val="12"/>
                 <w:lang w:val="da"/>
@@ -218,6 +253,9 @@
             <w:pPr>
               <w:spacing w:after="0"/>
               <w:ind w:left="105"/>
+              <w:rPr>
+                <w:lang w:val="da-DK"/>
+              </w:rPr>
             </w:pPr>
             <w:r>
               <w:rPr>
@@ -273,9 +311,10 @@
             </w:r>
             <w:r>
               <w:rPr>
-                <w:rFonts w:ascii="Calibri" w:hAnsi="Calibri" w:eastAsia="Calibri" w:cs="Calibri"/>
+                <w:rFonts w:ascii="Calibri" w:eastAsia="Calibri" w:hAnsi="Calibri" w:cs="Calibri"/>
                 <w:sz w:val="20"/>
                 <w:szCs w:val="20"/>
+                <w:lang w:val="da-DK"/>
               </w:rPr>
               <w:t xml:space="preserve"> </w:t>
             </w:r>
@@ -284,10 +323,13 @@
             <w:pPr>
               <w:spacing w:after="0"/>
               <w:ind w:left="105" w:right="1830"/>
+              <w:rPr>
+                <w:lang w:val="da-DK"/>
+              </w:rPr>
             </w:pPr>
             <w:r>
               <w:rPr>
-                <w:rFonts w:ascii="Calibri" w:hAnsi="Calibri" w:eastAsia="Calibri" w:cs="Calibri"/>
+                <w:rFonts w:ascii="Calibri" w:eastAsia="Calibri" w:hAnsi="Calibri" w:cs="Calibri"/>
                 <w:sz w:val="28"/>
                 <w:szCs w:val="28"/>
                 <w:lang w:val="da"/>
@@ -299,10 +341,13 @@
             <w:pPr>
               <w:spacing w:after="0"/>
               <w:ind w:left="105" w:right="1830"/>
+              <w:rPr>
+                <w:lang w:val="da-DK"/>
+              </w:rPr>
             </w:pPr>
             <w:r>
               <w:rPr>
-                <w:rFonts w:ascii="Calibri" w:hAnsi="Calibri" w:eastAsia="Calibri" w:cs="Calibri"/>
+                <w:rFonts w:ascii="Calibri" w:eastAsia="Calibri" w:hAnsi="Calibri" w:cs="Calibri"/>
                 <w:sz w:val="28"/>
                 <w:szCs w:val="28"/>
                 <w:lang w:val="da"/>
@@ -369,7 +414,7 @@
             </w:r>
             <w:r>
               <w:rPr>
-                <w:rFonts w:ascii="Calibri" w:hAnsi="Calibri" w:eastAsia="Calibri" w:cs="Calibri"/>
+                <w:rFonts w:ascii="Calibri" w:eastAsia="Calibri" w:hAnsi="Calibri" w:cs="Calibri"/>
                 <w:sz w:val="28"/>
                 <w:szCs w:val="28"/>
               </w:rPr>
@@ -383,7 +428,7 @@
             </w:pPr>
             <w:r>
               <w:rPr>
-                <w:rFonts w:ascii="Helvetica" w:hAnsi="Helvetica" w:eastAsia="Helvetica" w:cs="Helvetica"/>
+                <w:rFonts w:ascii="Helvetica" w:eastAsia="Helvetica" w:hAnsi="Helvetica" w:cs="Helvetica"/>
                 <w:color w:val="000000" w:themeColor="text1"/>
                 <w:sz w:val="22"/>
                 <w:szCs w:val="22"/>
@@ -393,7 +438,7 @@
             </w:r>
             <w:r>
               <w:rPr>
-                <w:rFonts w:ascii="Helvetica" w:hAnsi="Helvetica" w:eastAsia="Helvetica" w:cs="Helvetica"/>
+                <w:rFonts w:ascii="Helvetica" w:eastAsia="Helvetica" w:hAnsi="Helvetica" w:cs="Helvetica"/>
                 <w:color w:val="000000" w:themeColor="text1"/>
                 <w:sz w:val="22"/>
                 <w:szCs w:val="22"/>
@@ -408,7 +453,7 @@
             </w:pPr>
             <w:r>
               <w:rPr>
-                <w:rFonts w:ascii="Calibri" w:hAnsi="Calibri" w:eastAsia="Calibri" w:cs="Calibri"/>
+                <w:rFonts w:ascii="Calibri" w:eastAsia="Calibri" w:hAnsi="Calibri" w:cs="Calibri"/>
                 <w:sz w:val="28"/>
                 <w:szCs w:val="28"/>
               </w:rPr>
@@ -419,10 +464,13 @@
             <w:pPr>
               <w:spacing w:after="0"/>
               <w:ind w:left="105" w:right="1830"/>
+              <w:rPr>
+                <w:lang w:val="da-DK"/>
+              </w:rPr>
             </w:pPr>
             <w:r>
               <w:rPr>
-                <w:rFonts w:ascii="Calibri" w:hAnsi="Calibri" w:eastAsia="Calibri" w:cs="Calibri"/>
+                <w:rFonts w:ascii="Calibri" w:eastAsia="Calibri" w:hAnsi="Calibri" w:cs="Calibri"/>
                 <w:sz w:val="28"/>
                 <w:szCs w:val="28"/>
                 <w:lang w:val="da"/>
@@ -483,7 +531,7 @@
             </w:r>
             <w:r>
               <w:rPr>
-                <w:rFonts w:ascii="Calibri" w:hAnsi="Calibri" w:eastAsia="Calibri" w:cs="Calibri"/>
+                <w:rFonts w:ascii="Calibri" w:eastAsia="Calibri" w:hAnsi="Calibri" w:cs="Calibri"/>
                 <w:sz w:val="28"/>
                 <w:szCs w:val="28"/>
                 <w:lang w:val="da"/>
@@ -495,10 +543,13 @@
             <w:pPr>
               <w:spacing w:after="0"/>
               <w:ind w:left="105"/>
+              <w:rPr>
+                <w:lang w:val="da-DK"/>
+              </w:rPr>
             </w:pPr>
             <w:r>
               <w:rPr>
-                <w:rFonts w:ascii="Calibri" w:hAnsi="Calibri" w:eastAsia="Calibri" w:cs="Calibri"/>
+                <w:rFonts w:ascii="Calibri" w:eastAsia="Calibri" w:hAnsi="Calibri" w:cs="Calibri"/>
                 <w:sz w:val="28"/>
                 <w:szCs w:val="28"/>
                 <w:lang w:val="da"/>
@@ -559,7 +610,7 @@
             </w:r>
             <w:r>
               <w:rPr>
-                <w:rFonts w:ascii="Calibri" w:hAnsi="Calibri" w:eastAsia="Calibri" w:cs="Calibri"/>
+                <w:rFonts w:ascii="Calibri" w:eastAsia="Calibri" w:hAnsi="Calibri" w:cs="Calibri"/>
                 <w:sz w:val="28"/>
                 <w:szCs w:val="28"/>
                 <w:lang w:val="da"/>
@@ -573,10 +624,13 @@
     <w:p>
       <w:pPr>
         <w:spacing w:after="0"/>
-      </w:pPr>
-      <w:r>
-        <w:rPr>
-          <w:rFonts w:ascii="Calibri" w:hAnsi="Calibri" w:eastAsia="Calibri" w:cs="Calibri"/>
+        <w:rPr>
+          <w:lang w:val="da-DK"/>
+        </w:rPr>
+      </w:pPr>
+      <w:r>
+        <w:rPr>
+          <w:rFonts w:ascii="Calibri" w:eastAsia="Calibri" w:hAnsi="Calibri" w:cs="Calibri"/>
           <w:sz w:val="20"/>
           <w:szCs w:val="20"/>
           <w:lang w:val="da"/>
@@ -587,10 +641,13 @@
     <w:p>
       <w:pPr>
         <w:spacing w:after="0"/>
-      </w:pPr>
-      <w:r>
-        <w:rPr>
-          <w:rFonts w:ascii="Calibri" w:hAnsi="Calibri" w:eastAsia="Calibri" w:cs="Calibri"/>
+        <w:rPr>
+          <w:lang w:val="da-DK"/>
+        </w:rPr>
+      </w:pPr>
+      <w:r>
+        <w:rPr>
+          <w:rFonts w:ascii="Calibri" w:eastAsia="Calibri" w:hAnsi="Calibri" w:cs="Calibri"/>
           <w:sz w:val="14"/>
           <w:szCs w:val="14"/>
           <w:lang w:val="da"/>
@@ -601,236 +658,725 @@
     <w:p>
       <w:pPr>
         <w:spacing w:after="0"/>
-      </w:pPr>
-      <w:r>
-        <w:rPr>
-          <w:rFonts w:ascii="Calibri" w:hAnsi="Calibri" w:eastAsia="Calibri" w:cs="Calibri"/>
-          <w:sz w:val="14"/>
-          <w:szCs w:val="14"/>
-          <w:lang w:val="da"/>
-        </w:rPr>
-        <w:t xml:space="preserve"> </w:t>
-      </w:r>
+        <w:ind w:left="105"/>
+        <w:rPr>
+          <w:lang w:val="da-DK"/>
+        </w:rPr>
+      </w:pPr>
     </w:p>
     <w:p>
       <w:pPr>
         <w:spacing w:after="0"/>
-      </w:pPr>
-      <w:r>
-        <w:rPr>
-          <w:rFonts w:ascii="Calibri" w:hAnsi="Calibri" w:eastAsia="Calibri" w:cs="Calibri"/>
-          <w:sz w:val="14"/>
-          <w:szCs w:val="14"/>
-          <w:lang w:val="da"/>
-        </w:rPr>
-        <w:t xml:space="preserve"> </w:t>
+        <w:ind w:left="105" w:right="180"/>
+        <w:rPr>
+          <w:lang w:val="da-DK"/>
+        </w:rPr>
+      </w:pPr>
+      <w:r>
+        <w:rPr>
+          <w:rFonts w:ascii="Calibri" w:eastAsia="Calibri" w:hAnsi="Calibri" w:cs="Calibri"/>
+          <w:sz w:val="28"/>
+          <w:szCs w:val="28"/>
+          <w:lang w:val="da"/>
+        </w:rPr>
+        <w:t xml:space="preserve">Kan du lave et program </w:t>
+      </w:r>
+      <w:r>
+        <w:rPr>
+          <w:rFonts w:ascii="Calibri" w:eastAsia="Calibri" w:hAnsi="Calibri" w:cs="Calibri"/>
+          <w:sz w:val="28"/>
+          <w:szCs w:val="28"/>
+          <w:lang w:val="da"/>
+        </w:rPr>
+        <w:t>der tegner</w:t>
+      </w:r>
+      <w:r>
+        <w:rPr>
+          <w:rFonts w:ascii="Calibri" w:eastAsia="Calibri" w:hAnsi="Calibri" w:cs="Calibri"/>
+          <w:sz w:val="28"/>
+          <w:szCs w:val="28"/>
+          <w:lang w:val="da"/>
+        </w:rPr>
+        <w:t xml:space="preserve"> en fodboldbane/eller andre </w:t>
+      </w:r>
+      <w:r>
+        <w:rPr>
+          <w:rFonts w:ascii="Calibri" w:eastAsia="Calibri" w:hAnsi="Calibri" w:cs="Calibri"/>
+          <w:sz w:val="28"/>
+          <w:szCs w:val="28"/>
+          <w:lang w:val="da"/>
+        </w:rPr>
+        <w:t>bane?</w:t>
+      </w:r>
+      <w:r>
+        <w:rPr>
+          <w:rFonts w:ascii="Calibri" w:eastAsia="Calibri" w:hAnsi="Calibri" w:cs="Calibri"/>
+          <w:sz w:val="28"/>
+          <w:szCs w:val="28"/>
+          <w:lang w:val="da"/>
+        </w:rPr>
+        <w:t xml:space="preserve">    </w:t>
       </w:r>
     </w:p>
     <w:p>
       <w:pPr>
         <w:spacing w:after="0"/>
-      </w:pPr>
-      <w:r>
-        <w:rPr>
-          <w:rFonts w:ascii="Calibri" w:hAnsi="Calibri" w:eastAsia="Calibri" w:cs="Calibri"/>
-          <w:sz w:val="14"/>
-          <w:szCs w:val="14"/>
-          <w:lang w:val="da"/>
-        </w:rPr>
-        <w:t xml:space="preserve"> </w:t>
+        <w:ind w:left="105"/>
+        <w:rPr>
+          <w:lang w:val="da-DK"/>
+        </w:rPr>
+      </w:pPr>
+      <w:r>
+        <w:rPr>
+          <w:rFonts w:ascii="Calibri" w:eastAsia="Calibri" w:hAnsi="Calibri" w:cs="Calibri"/>
+          <w:color w:val="FF0000"/>
+          <w:sz w:val="28"/>
+          <w:szCs w:val="28"/>
+          <w:lang w:val="da"/>
+        </w:rPr>
+        <w:t xml:space="preserve">Udfordring: </w:t>
+      </w:r>
+      <w:r>
+        <w:rPr>
+          <w:rFonts w:ascii="Calibri" w:eastAsia="Calibri" w:hAnsi="Calibri" w:cs="Calibri"/>
+          <w:sz w:val="28"/>
+          <w:szCs w:val="28"/>
+          <w:lang w:val="da"/>
+        </w:rPr>
+        <w:t xml:space="preserve">Tegn banen kun ved brug af en Sprite. </w:t>
       </w:r>
     </w:p>
     <w:p>
       <w:pPr>
-        <w:spacing w:after="0"/>
-      </w:pPr>
-      <w:r>
-        <w:rPr>
-          <w:noProof/>
-        </w:rPr>
-        <w:drawing>
-          <wp:inline distT="0" distB="0" distL="0" distR="0" wp14:anchorId="337A5B5A" wp14:editId="527BA0BD">
-            <wp:extent cx="2305050" cy="1257300"/>
-            <wp:effectExtent l="0" t="0" r="0" b="0"/>
-            <wp:docPr id="627499924" name="drawing" descr="A black and white image of a basketball court&#10;&#10;AI-generated content may be incorrect.">
-              <a:extLst xmlns:a="http://schemas.openxmlformats.org/drawingml/2006/main">
-                <a:ext uri="{FF2B5EF4-FFF2-40B4-BE49-F238E27FC236}">
-                  <a16:creationId xmlns:a16="http://schemas.microsoft.com/office/drawing/2014/main" id="{17C11EC1-74C5-46E1-AEBB-70DF3BD180BA}"/>
-                </a:ext>
-              </a:extLst>
-            </wp:docPr>
-            <wp:cNvGraphicFramePr>
-              <a:graphicFrameLocks xmlns:a="http://schemas.openxmlformats.org/drawingml/2006/main" noChangeAspect="1"/>
-            </wp:cNvGraphicFramePr>
-            <a:graphic xmlns:a="http://schemas.openxmlformats.org/drawingml/2006/main">
-              <a:graphicData uri="http://schemas.openxmlformats.org/drawingml/2006/picture">
-                <pic:pic xmlns:pic="http://schemas.openxmlformats.org/drawingml/2006/picture">
-                  <pic:nvPicPr>
-                    <pic:cNvPr id="627499924" name=""/>
-                    <pic:cNvPicPr/>
-                  </pic:nvPicPr>
-                  <pic:blipFill>
-                    <a:blip r:embed="rId12">
-                      <a:extLst>
-                        <a:ext uri="{28A0092B-C50C-407E-A947-70E740481C1C}">
-                          <a14:useLocalDpi xmlns:a14="http://schemas.microsoft.com/office/drawing/2010/main" val="0"/>
-                        </a:ext>
-                      </a:extLst>
-                    </a:blip>
-                    <a:stretch>
-                      <a:fillRect/>
-                    </a:stretch>
-                  </pic:blipFill>
-                  <pic:spPr>
-                    <a:xfrm>
-                      <a:off x="0" y="0"/>
-                      <a:ext cx="2305050" cy="1257300"/>
-                    </a:xfrm>
-                    <a:prstGeom prst="rect">
-                      <a:avLst/>
-                    </a:prstGeom>
-                  </pic:spPr>
-                </pic:pic>
-              </a:graphicData>
-            </a:graphic>
-          </wp:inline>
-        </w:drawing>
-      </w:r>
-      <w:r>
-        <w:rPr>
-          <w:rFonts w:ascii="Calibri" w:hAnsi="Calibri" w:eastAsia="Calibri" w:cs="Calibri"/>
-          <w:sz w:val="14"/>
-          <w:szCs w:val="14"/>
-        </w:rPr>
-        <w:t xml:space="preserve"> </w:t>
-      </w:r>
+        <w:pBdr>
+          <w:bottom w:val="single" w:sz="6" w:space="1" w:color="auto"/>
+        </w:pBdr>
+        <w:spacing w:after="200" w:line="276" w:lineRule="auto"/>
+        <w:ind w:left="360"/>
+        <w:rPr>
+          <w:rFonts w:ascii="Cambria" w:eastAsia="Cambria" w:hAnsi="Cambria" w:cs="Cambria"/>
+          <w:sz w:val="22"/>
+          <w:szCs w:val="22"/>
+          <w:lang w:val="da-DK"/>
+        </w:rPr>
+      </w:pPr>
     </w:p>
     <w:p>
       <w:pPr>
-        <w:spacing w:after="0"/>
-      </w:pPr>
-      <w:r>
-        <w:rPr>
-          <w:rFonts w:ascii="Calibri" w:hAnsi="Calibri" w:eastAsia="Calibri" w:cs="Calibri"/>
-          <w:sz w:val="12"/>
-          <w:szCs w:val="12"/>
-        </w:rPr>
-        <w:t xml:space="preserve"> </w:t>
-      </w:r>
+        <w:rPr>
+          <w:rFonts w:ascii="Cambria" w:eastAsia="Cambria" w:hAnsi="Cambria" w:cs="Cambria"/>
+          <w:sz w:val="22"/>
+          <w:szCs w:val="22"/>
+        </w:rPr>
+      </w:pPr>
     </w:p>
     <w:p>
       <w:pPr>
-        <w:spacing w:after="0"/>
-        <w:ind w:left="105"/>
-      </w:pPr>
-      <w:r>
-        <w:rPr>
-          <w:rFonts w:ascii="Calibri" w:hAnsi="Calibri" w:eastAsia="Calibri" w:cs="Calibri"/>
+        <w:rPr>
+          <w:rFonts w:ascii="Cambria" w:eastAsia="Cambria" w:hAnsi="Cambria" w:cs="Cambria"/>
+          <w:sz w:val="22"/>
+          <w:szCs w:val="22"/>
+        </w:rPr>
+      </w:pPr>
+    </w:p>
+    <w:p>
+      <w:pPr>
+        <w:pStyle w:val="Heading1"/>
+        <w:spacing w:before="480" w:after="0" w:line="276" w:lineRule="auto"/>
+        <w:rPr>
+          <w:rFonts w:ascii="Calibri" w:eastAsia="Calibri" w:hAnsi="Calibri" w:cs="Calibri"/>
           <w:b/>
           <w:bCs/>
-          <w:sz w:val="28"/>
-          <w:szCs w:val="28"/>
-          <w:u w:val="single"/>
-        </w:rPr>
-        <w:t xml:space="preserve"> </w:t>
+          <w:color w:val="365F91"/>
+          <w:sz w:val="28"/>
+          <w:szCs w:val="28"/>
+          <w:lang w:val="da-DK" w:eastAsia="zh-CN"/>
+        </w:rPr>
+      </w:pPr>
+      <w:r>
+        <w:rPr>
+          <w:rFonts w:ascii="Calibri" w:eastAsia="Calibri" w:hAnsi="Calibri" w:cs="Calibri"/>
+          <w:b/>
+          <w:bCs/>
+          <w:color w:val="365F91"/>
+          <w:sz w:val="28"/>
+          <w:szCs w:val="28"/>
+          <w:lang w:val="da-DK" w:eastAsia="zh-CN"/>
+        </w:rPr>
+        <w:lastRenderedPageBreak/>
+        <w:t xml:space="preserve">Tirsdag </w:t>
+      </w:r>
+      <w:r>
+        <w:rPr>
+          <w:rFonts w:ascii="Calibri" w:eastAsia="Calibri" w:hAnsi="Calibri" w:cs="Calibri"/>
+          <w:b/>
+          <w:bCs/>
+          <w:color w:val="365F91"/>
+          <w:sz w:val="28"/>
+          <w:szCs w:val="28"/>
+          <w:lang w:val="da-DK" w:eastAsia="zh-CN"/>
+        </w:rPr>
+        <w:t>Opgave:</w:t>
       </w:r>
     </w:p>
     <w:p>
       <w:pPr>
+        <w:pStyle w:val="Heading1"/>
+        <w:spacing w:before="480" w:after="0" w:line="276" w:lineRule="auto"/>
+        <w:rPr>
+          <w:rFonts w:ascii="Calibri" w:eastAsia="Calibri" w:hAnsi="Calibri" w:cs="Calibri"/>
+          <w:b/>
+          <w:bCs/>
+          <w:color w:val="365F91"/>
+          <w:sz w:val="28"/>
+          <w:szCs w:val="28"/>
+          <w:lang w:val="da-DK" w:eastAsia="zh-CN"/>
+        </w:rPr>
+      </w:pPr>
+      <w:r>
+        <w:rPr>
+          <w:rFonts w:ascii="Calibri" w:eastAsia="Calibri" w:hAnsi="Calibri" w:cs="Calibri"/>
+          <w:b/>
+          <w:bCs/>
+          <w:color w:val="365F91"/>
+          <w:sz w:val="28"/>
+          <w:szCs w:val="28"/>
+          <w:lang w:val="da-DK" w:eastAsia="zh-CN"/>
+        </w:rPr>
+        <w:t xml:space="preserve"> Tænk dybere – AI</w:t>
+      </w:r>
+      <w:r>
+        <w:rPr>
+          <w:rFonts w:ascii="Calibri" w:eastAsia="Calibri" w:hAnsi="Calibri" w:cs="Calibri"/>
+          <w:b/>
+          <w:bCs/>
+          <w:color w:val="365F91"/>
+          <w:sz w:val="28"/>
+          <w:szCs w:val="28"/>
+          <w:lang w:val="da-DK" w:eastAsia="zh-CN"/>
+        </w:rPr>
+        <w:noBreakHyphen/>
+        <w:t>algoritmer i vores hverdag</w:t>
+      </w:r>
+    </w:p>
+    <w:p>
+      <w:pPr>
         <w:spacing w:after="0"/>
         <w:ind w:left="105" w:right="180"/>
-      </w:pPr>
-      <w:r>
-        <w:rPr>
-          <w:rFonts w:ascii="Calibri" w:hAnsi="Calibri" w:eastAsia="Calibri" w:cs="Calibri"/>
-          <w:sz w:val="28"/>
-          <w:szCs w:val="28"/>
-          <w:lang w:val="da"/>
-        </w:rPr>
-        <w:t xml:space="preserve">Kan du lave et program der  tegner en fodboldbane/eller andre bane ?    </w:t>
+        <w:rPr>
+          <w:rFonts w:ascii="Calibri" w:eastAsia="Calibri" w:hAnsi="Calibri" w:cs="Calibri"/>
+          <w:sz w:val="28"/>
+          <w:szCs w:val="28"/>
+          <w:lang w:val="da"/>
+        </w:rPr>
+      </w:pPr>
+      <w:r>
+        <w:rPr>
+          <w:rFonts w:ascii="Calibri" w:eastAsia="Calibri" w:hAnsi="Calibri" w:cs="Calibri"/>
+          <w:sz w:val="28"/>
+          <w:szCs w:val="28"/>
+          <w:lang w:val="da"/>
+        </w:rPr>
+        <w:t xml:space="preserve">Vi har lavet algoritmer i Scratch, hvor </w:t>
+      </w:r>
+      <w:r>
+        <w:rPr>
+          <w:rFonts w:ascii="Calibri" w:eastAsia="Calibri" w:hAnsi="Calibri" w:cs="Calibri"/>
+          <w:b/>
+          <w:bCs/>
+          <w:sz w:val="28"/>
+          <w:szCs w:val="28"/>
+          <w:lang w:val="da"/>
+        </w:rPr>
+        <w:t>vi mennesker skriver alle trin</w:t>
+      </w:r>
+      <w:r>
+        <w:rPr>
+          <w:rFonts w:ascii="Calibri" w:eastAsia="Calibri" w:hAnsi="Calibri" w:cs="Calibri"/>
+          <w:sz w:val="28"/>
+          <w:szCs w:val="28"/>
+          <w:lang w:val="da"/>
+        </w:rPr>
+        <w:t>. Men mange moderne systemer bruger AI</w:t>
+      </w:r>
+      <w:r>
+        <w:rPr>
+          <w:rFonts w:ascii="Calibri" w:eastAsia="Calibri" w:hAnsi="Calibri" w:cs="Calibri"/>
+          <w:sz w:val="28"/>
+          <w:szCs w:val="28"/>
+          <w:lang w:val="da"/>
+        </w:rPr>
+        <w:noBreakHyphen/>
+        <w:t>algoritmer: De lærer mønstre fra store mængder data i stedet for at få alle regler skrevet af os.</w:t>
       </w:r>
     </w:p>
     <w:p>
       <w:pPr>
         <w:spacing w:after="0"/>
-        <w:ind w:left="105"/>
-      </w:pPr>
-      <w:r>
-        <w:rPr>
-          <w:rFonts w:ascii="Calibri" w:hAnsi="Calibri" w:eastAsia="Calibri" w:cs="Calibri"/>
-          <w:color w:val="FF0000"/>
-          <w:sz w:val="28"/>
-          <w:szCs w:val="28"/>
-          <w:lang w:val="da"/>
-        </w:rPr>
-        <w:t xml:space="preserve">Udfordring: </w:t>
-      </w:r>
-      <w:r>
-        <w:rPr>
-          <w:rFonts w:ascii="Calibri" w:hAnsi="Calibri" w:eastAsia="Calibri" w:cs="Calibri"/>
-          <w:sz w:val="28"/>
-          <w:szCs w:val="28"/>
-          <w:lang w:val="da"/>
-        </w:rPr>
-        <w:t xml:space="preserve">Tegn halvbuerne. </w:t>
+        <w:ind w:left="105" w:right="180"/>
+        <w:rPr>
+          <w:rFonts w:ascii="Calibri" w:eastAsia="Calibri" w:hAnsi="Calibri" w:cs="Calibri"/>
+          <w:sz w:val="28"/>
+          <w:szCs w:val="28"/>
+          <w:lang w:val="da"/>
+        </w:rPr>
+      </w:pPr>
+      <w:r>
+        <w:rPr>
+          <w:rFonts w:ascii="Calibri" w:eastAsia="Calibri" w:hAnsi="Calibri" w:cs="Calibri"/>
+          <w:sz w:val="28"/>
+          <w:szCs w:val="28"/>
+          <w:lang w:val="da"/>
+        </w:rPr>
+        <w:t>To eksempler vi kender fra virkeligheden:</w:t>
       </w:r>
     </w:p>
     <w:p>
       <w:pPr>
         <w:spacing w:after="0"/>
-        <w:ind w:left="105"/>
-      </w:pPr>
-      <w:r>
-        <w:rPr>
-          <w:rFonts w:ascii="Calibri" w:hAnsi="Calibri" w:eastAsia="Calibri" w:cs="Calibri"/>
-          <w:color w:val="FF0000"/>
-          <w:sz w:val="28"/>
-          <w:szCs w:val="28"/>
-          <w:lang w:val="da"/>
-        </w:rPr>
-        <w:t xml:space="preserve">Udfordring: </w:t>
-      </w:r>
-      <w:r>
-        <w:rPr>
-          <w:rFonts w:ascii="Calibri" w:hAnsi="Calibri" w:eastAsia="Calibri" w:cs="Calibri"/>
-          <w:sz w:val="28"/>
-          <w:szCs w:val="28"/>
-          <w:lang w:val="da"/>
-        </w:rPr>
-        <w:t xml:space="preserve">Tegn banen kun ved brug af en Sprite. </w:t>
+        <w:ind w:left="105" w:right="180"/>
+        <w:rPr>
+          <w:rFonts w:ascii="Calibri" w:eastAsia="Calibri" w:hAnsi="Calibri" w:cs="Calibri"/>
+          <w:sz w:val="28"/>
+          <w:szCs w:val="28"/>
+          <w:lang w:val="da"/>
+        </w:rPr>
+      </w:pPr>
+      <w:proofErr w:type="spellStart"/>
+      <w:r>
+        <w:rPr>
+          <w:rFonts w:ascii="Calibri" w:eastAsia="Calibri" w:hAnsi="Calibri" w:cs="Calibri"/>
+          <w:sz w:val="28"/>
+          <w:szCs w:val="28"/>
+          <w:lang w:val="da"/>
+        </w:rPr>
+        <w:t>Selvkørende</w:t>
+      </w:r>
+      <w:proofErr w:type="spellEnd"/>
+      <w:r>
+        <w:rPr>
+          <w:rFonts w:ascii="Calibri" w:eastAsia="Calibri" w:hAnsi="Calibri" w:cs="Calibri"/>
+          <w:sz w:val="28"/>
+          <w:szCs w:val="28"/>
+          <w:lang w:val="da"/>
+        </w:rPr>
+        <w:t xml:space="preserve"> </w:t>
+      </w:r>
+      <w:proofErr w:type="spellStart"/>
+      <w:r>
+        <w:rPr>
+          <w:rFonts w:ascii="Calibri" w:eastAsia="Calibri" w:hAnsi="Calibri" w:cs="Calibri"/>
+          <w:sz w:val="28"/>
+          <w:szCs w:val="28"/>
+          <w:lang w:val="da"/>
+        </w:rPr>
+        <w:t>biler</w:t>
+      </w:r>
+      <w:proofErr w:type="spellEnd"/>
+      <w:r>
+        <w:rPr>
+          <w:rFonts w:ascii="Calibri" w:eastAsia="Calibri" w:hAnsi="Calibri" w:cs="Calibri"/>
+          <w:sz w:val="28"/>
+          <w:szCs w:val="28"/>
+          <w:lang w:val="da"/>
+        </w:rPr>
+        <w:t xml:space="preserve"> (</w:t>
+      </w:r>
+      <w:proofErr w:type="spellStart"/>
+      <w:r>
+        <w:rPr>
+          <w:rFonts w:ascii="Calibri" w:eastAsia="Calibri" w:hAnsi="Calibri" w:cs="Calibri"/>
+          <w:sz w:val="28"/>
+          <w:szCs w:val="28"/>
+          <w:lang w:val="da"/>
+        </w:rPr>
+        <w:t>automatisk</w:t>
+      </w:r>
+      <w:proofErr w:type="spellEnd"/>
+      <w:r>
+        <w:rPr>
+          <w:rFonts w:ascii="Calibri" w:eastAsia="Calibri" w:hAnsi="Calibri" w:cs="Calibri"/>
+          <w:sz w:val="28"/>
+          <w:szCs w:val="28"/>
+          <w:lang w:val="da"/>
+        </w:rPr>
+        <w:t xml:space="preserve"> </w:t>
+      </w:r>
+      <w:proofErr w:type="spellStart"/>
+      <w:r>
+        <w:rPr>
+          <w:rFonts w:ascii="Calibri" w:eastAsia="Calibri" w:hAnsi="Calibri" w:cs="Calibri"/>
+          <w:sz w:val="28"/>
+          <w:szCs w:val="28"/>
+          <w:lang w:val="da"/>
+        </w:rPr>
+        <w:t>kørsel</w:t>
+      </w:r>
+      <w:proofErr w:type="spellEnd"/>
+      <w:r>
+        <w:rPr>
+          <w:rFonts w:ascii="Calibri" w:eastAsia="Calibri" w:hAnsi="Calibri" w:cs="Calibri"/>
+          <w:sz w:val="28"/>
+          <w:szCs w:val="28"/>
+          <w:lang w:val="da"/>
+        </w:rPr>
+        <w:t>)</w:t>
       </w:r>
     </w:p>
     <w:p>
       <w:pPr>
-        <w:spacing w:after="200" w:line="276" w:lineRule="auto"/>
-        <w:ind w:left="360"/>
-        <w:rPr>
-          <w:rFonts w:ascii="Cambria" w:hAnsi="Cambria" w:eastAsia="Cambria" w:cs="Cambria"/>
-          <w:sz w:val="22"/>
-          <w:szCs w:val="22"/>
-        </w:rPr>
-      </w:pPr>
+        <w:spacing w:after="0"/>
+        <w:ind w:left="105" w:right="180"/>
+        <w:rPr>
+          <w:rFonts w:ascii="Calibri" w:eastAsia="Calibri" w:hAnsi="Calibri" w:cs="Calibri"/>
+          <w:sz w:val="28"/>
+          <w:szCs w:val="28"/>
+          <w:lang w:val="da"/>
+        </w:rPr>
+      </w:pPr>
+      <w:r>
+        <w:rPr>
+          <w:rFonts w:ascii="Calibri" w:eastAsia="Calibri" w:hAnsi="Calibri" w:cs="Calibri"/>
+          <w:sz w:val="28"/>
+          <w:szCs w:val="28"/>
+          <w:lang w:val="da"/>
+        </w:rPr>
+        <w:t>Video</w:t>
+      </w:r>
+      <w:r>
+        <w:rPr>
+          <w:rFonts w:ascii="Calibri" w:eastAsia="Calibri" w:hAnsi="Calibri" w:cs="Calibri"/>
+          <w:sz w:val="28"/>
+          <w:szCs w:val="28"/>
+          <w:lang w:val="da"/>
+        </w:rPr>
+        <w:noBreakHyphen/>
+        <w:t xml:space="preserve">anbefalinger på f.eks. YouTube </w:t>
+      </w:r>
     </w:p>
     <w:p>
       <w:pPr>
-        <w:rPr>
-          <w:rFonts w:ascii="Aptos" w:hAnsi="Aptos" w:eastAsia="Aptos" w:cs="Aptos"/>
-          <w:sz w:val="52"/>
-          <w:szCs w:val="52"/>
-          <w:lang w:val="da-DK"/>
-        </w:rPr>
-      </w:pPr>
-      <w:r>
-        <w:rPr>
-          <w:rFonts w:ascii="Cambria" w:hAnsi="Cambria" w:eastAsia="Cambria" w:cs="Cambria"/>
-          <w:sz w:val="22"/>
-          <w:szCs w:val="22"/>
-        </w:rPr>
-        <w:t>————</w:t>
-      </w:r>
+        <w:spacing w:after="0"/>
+        <w:ind w:left="105" w:right="180"/>
+        <w:rPr>
+          <w:rFonts w:ascii="Calibri" w:eastAsia="Calibri" w:hAnsi="Calibri" w:cs="Calibri"/>
+          <w:sz w:val="28"/>
+          <w:szCs w:val="28"/>
+          <w:lang w:val="da"/>
+        </w:rPr>
+      </w:pPr>
+      <w:r>
+        <w:rPr>
+          <w:rFonts w:ascii="Calibri" w:eastAsia="Calibri" w:hAnsi="Calibri" w:cs="Calibri"/>
+          <w:sz w:val="28"/>
+          <w:szCs w:val="28"/>
+          <w:lang w:val="da"/>
+        </w:rPr>
+        <w:t>Spørgsmål til gruppen (skriv korte svar):</w:t>
+      </w:r>
+    </w:p>
+    <w:p>
+      <w:pPr>
+        <w:spacing w:after="0"/>
+        <w:ind w:left="105" w:right="180"/>
+        <w:rPr>
+          <w:rFonts w:ascii="Calibri" w:eastAsia="Calibri" w:hAnsi="Calibri" w:cs="Calibri"/>
+          <w:sz w:val="28"/>
+          <w:szCs w:val="28"/>
+          <w:lang w:val="da"/>
+        </w:rPr>
+      </w:pPr>
+      <w:r>
+        <w:rPr>
+          <w:rFonts w:ascii="Calibri" w:eastAsia="Calibri" w:hAnsi="Calibri" w:cs="Calibri"/>
+          <w:sz w:val="28"/>
+          <w:szCs w:val="28"/>
+          <w:lang w:val="da"/>
+        </w:rPr>
+        <w:t>Hvad er forskellen på den algoritme, vi lavede i Scratch, og en AI</w:t>
+      </w:r>
+      <w:r>
+        <w:rPr>
+          <w:rFonts w:ascii="Calibri" w:eastAsia="Calibri" w:hAnsi="Calibri" w:cs="Calibri"/>
+          <w:sz w:val="28"/>
+          <w:szCs w:val="28"/>
+          <w:lang w:val="da"/>
+        </w:rPr>
+        <w:noBreakHyphen/>
+        <w:t>algoritme til selvkørende biler eller videoanbefaling?</w:t>
+      </w:r>
+    </w:p>
+    <w:p>
+      <w:pPr>
+        <w:spacing w:after="0"/>
+        <w:ind w:left="105" w:right="180"/>
+        <w:rPr>
+          <w:rFonts w:ascii="Calibri" w:eastAsia="Calibri" w:hAnsi="Calibri" w:cs="Calibri"/>
+          <w:sz w:val="28"/>
+          <w:szCs w:val="28"/>
+          <w:lang w:val="da"/>
+        </w:rPr>
+      </w:pPr>
+      <w:r>
+        <w:rPr>
+          <w:rFonts w:ascii="Calibri" w:eastAsia="Calibri" w:hAnsi="Calibri" w:cs="Calibri"/>
+          <w:sz w:val="28"/>
+          <w:szCs w:val="28"/>
+          <w:lang w:val="da"/>
+        </w:rPr>
+        <w:t xml:space="preserve">Tag eksemplet med </w:t>
+      </w:r>
+      <w:r>
+        <w:rPr>
+          <w:rFonts w:ascii="Calibri" w:eastAsia="Calibri" w:hAnsi="Calibri" w:cs="Calibri"/>
+          <w:b/>
+          <w:bCs/>
+          <w:sz w:val="28"/>
+          <w:szCs w:val="28"/>
+          <w:lang w:val="da"/>
+        </w:rPr>
+        <w:t>selvkørende bil</w:t>
+      </w:r>
+      <w:r>
+        <w:rPr>
+          <w:rFonts w:ascii="Calibri" w:eastAsia="Calibri" w:hAnsi="Calibri" w:cs="Calibri"/>
+          <w:sz w:val="28"/>
+          <w:szCs w:val="28"/>
+          <w:lang w:val="da"/>
+        </w:rPr>
+        <w:t xml:space="preserve">: </w:t>
+      </w:r>
+      <w:r>
+        <w:rPr>
+          <w:rFonts w:ascii="Calibri" w:eastAsia="Calibri" w:hAnsi="Calibri" w:cs="Calibri"/>
+          <w:sz w:val="28"/>
+          <w:szCs w:val="28"/>
+          <w:lang w:val="da"/>
+        </w:rPr>
+        <w:t> </w:t>
+      </w:r>
+    </w:p>
+    <w:p>
+      <w:pPr>
+        <w:spacing w:after="0"/>
+        <w:ind w:left="105" w:right="180"/>
+        <w:rPr>
+          <w:rFonts w:ascii="Calibri" w:eastAsia="Calibri" w:hAnsi="Calibri" w:cs="Calibri"/>
+          <w:sz w:val="28"/>
+          <w:szCs w:val="28"/>
+          <w:lang w:val="da"/>
+        </w:rPr>
+      </w:pPr>
+      <w:r>
+        <w:rPr>
+          <w:rFonts w:ascii="Calibri" w:eastAsia="Calibri" w:hAnsi="Calibri" w:cs="Calibri"/>
+          <w:sz w:val="28"/>
+          <w:szCs w:val="28"/>
+          <w:lang w:val="da"/>
+        </w:rPr>
+        <w:t xml:space="preserve">a) Hvilke opgaver skal algoritmen klare? </w:t>
+      </w:r>
+      <w:r>
+        <w:rPr>
+          <w:rFonts w:ascii="Calibri" w:eastAsia="Calibri" w:hAnsi="Calibri" w:cs="Calibri"/>
+          <w:sz w:val="28"/>
+          <w:szCs w:val="28"/>
+          <w:lang w:val="da"/>
+        </w:rPr>
+        <w:t> </w:t>
+      </w:r>
+    </w:p>
+    <w:p>
+      <w:pPr>
+        <w:spacing w:after="0"/>
+        <w:ind w:left="105" w:right="180"/>
+        <w:rPr>
+          <w:rFonts w:ascii="Calibri" w:eastAsia="Calibri" w:hAnsi="Calibri" w:cs="Calibri"/>
+          <w:sz w:val="28"/>
+          <w:szCs w:val="28"/>
+          <w:lang w:val="da"/>
+        </w:rPr>
+      </w:pPr>
+      <w:r>
+        <w:rPr>
+          <w:rFonts w:ascii="Calibri" w:eastAsia="Calibri" w:hAnsi="Calibri" w:cs="Calibri"/>
+          <w:sz w:val="28"/>
+          <w:szCs w:val="28"/>
+          <w:lang w:val="da"/>
+        </w:rPr>
+        <w:t>b) Hvilke problemer / fejl kan denne AI</w:t>
+      </w:r>
+      <w:r>
+        <w:rPr>
+          <w:rFonts w:ascii="Calibri" w:eastAsia="Calibri" w:hAnsi="Calibri" w:cs="Calibri"/>
+          <w:sz w:val="28"/>
+          <w:szCs w:val="28"/>
+          <w:lang w:val="da"/>
+        </w:rPr>
+        <w:noBreakHyphen/>
+        <w:t xml:space="preserve">algoritme </w:t>
+      </w:r>
+      <w:proofErr w:type="gramStart"/>
+      <w:r>
+        <w:rPr>
+          <w:rFonts w:ascii="Calibri" w:eastAsia="Calibri" w:hAnsi="Calibri" w:cs="Calibri"/>
+          <w:sz w:val="28"/>
+          <w:szCs w:val="28"/>
+          <w:lang w:val="da"/>
+        </w:rPr>
+        <w:t>få?.</w:t>
+      </w:r>
+      <w:proofErr w:type="gramEnd"/>
+      <w:r>
+        <w:rPr>
+          <w:rFonts w:ascii="Calibri" w:eastAsia="Calibri" w:hAnsi="Calibri" w:cs="Calibri"/>
+          <w:sz w:val="28"/>
+          <w:szCs w:val="28"/>
+          <w:lang w:val="da"/>
+        </w:rPr>
+        <w:t xml:space="preserve"> </w:t>
+      </w:r>
+      <w:r>
+        <w:rPr>
+          <w:rFonts w:ascii="Calibri" w:eastAsia="Calibri" w:hAnsi="Calibri" w:cs="Calibri"/>
+          <w:sz w:val="28"/>
+          <w:szCs w:val="28"/>
+          <w:lang w:val="da"/>
+        </w:rPr>
+        <w:t> </w:t>
+      </w:r>
+    </w:p>
+    <w:p>
+      <w:pPr>
+        <w:spacing w:after="0"/>
+        <w:ind w:left="105" w:right="180"/>
+        <w:rPr>
+          <w:rFonts w:ascii="Calibri" w:eastAsia="Calibri" w:hAnsi="Calibri" w:cs="Calibri"/>
+          <w:sz w:val="28"/>
+          <w:szCs w:val="28"/>
+          <w:lang w:val="da"/>
+        </w:rPr>
+      </w:pPr>
+      <w:r>
+        <w:rPr>
+          <w:rFonts w:ascii="Calibri" w:eastAsia="Calibri" w:hAnsi="Calibri" w:cs="Calibri"/>
+          <w:sz w:val="28"/>
+          <w:szCs w:val="28"/>
+          <w:lang w:val="da"/>
+        </w:rPr>
+        <w:t>c) Hvad kan konsekvenserne være, hvis algoritmen tager fejl her?</w:t>
+      </w:r>
+    </w:p>
+    <w:p>
+      <w:pPr>
+        <w:spacing w:after="0"/>
+        <w:ind w:left="105" w:right="180"/>
+        <w:rPr>
+          <w:rFonts w:ascii="Calibri" w:eastAsia="Calibri" w:hAnsi="Calibri" w:cs="Calibri"/>
+          <w:sz w:val="28"/>
+          <w:szCs w:val="28"/>
+          <w:lang w:val="da"/>
+        </w:rPr>
+      </w:pPr>
+    </w:p>
+    <w:p>
+      <w:pPr>
+        <w:spacing w:after="0"/>
+        <w:ind w:right="180"/>
+        <w:rPr>
+          <w:rFonts w:ascii="Calibri" w:eastAsia="Calibri" w:hAnsi="Calibri" w:cs="Calibri"/>
+          <w:sz w:val="28"/>
+          <w:szCs w:val="28"/>
+          <w:lang w:val="da"/>
+        </w:rPr>
+      </w:pPr>
+      <w:r>
+        <w:rPr>
+          <w:rFonts w:ascii="Calibri" w:eastAsia="Calibri" w:hAnsi="Calibri" w:cs="Calibri"/>
+          <w:sz w:val="28"/>
+          <w:szCs w:val="28"/>
+          <w:lang w:val="da"/>
+        </w:rPr>
+        <w:t>Refleksionsspørgsmål (vigtigst):</w:t>
+      </w:r>
+    </w:p>
+    <w:p>
+      <w:pPr>
+        <w:spacing w:after="0"/>
+        <w:ind w:left="105" w:right="180"/>
+        <w:rPr>
+          <w:rFonts w:ascii="Calibri" w:eastAsia="Calibri" w:hAnsi="Calibri" w:cs="Calibri"/>
+          <w:sz w:val="28"/>
+          <w:szCs w:val="28"/>
+          <w:lang w:val="da"/>
+        </w:rPr>
+      </w:pPr>
+      <w:r>
+        <w:rPr>
+          <w:rFonts w:ascii="Calibri" w:eastAsia="Calibri" w:hAnsi="Calibri" w:cs="Calibri"/>
+          <w:sz w:val="28"/>
+          <w:szCs w:val="28"/>
+          <w:lang w:val="da"/>
+        </w:rPr>
+        <w:t xml:space="preserve">Er det nok at sige: </w:t>
+      </w:r>
+      <w:r>
+        <w:rPr>
+          <w:rFonts w:ascii="Calibri" w:eastAsia="Calibri" w:hAnsi="Calibri" w:cs="Calibri"/>
+          <w:i/>
+          <w:iCs/>
+          <w:sz w:val="28"/>
+          <w:szCs w:val="28"/>
+          <w:lang w:val="da"/>
+        </w:rPr>
+        <w:t>“AI skrev koden</w:t>
+      </w:r>
+      <w:r>
+        <w:rPr>
+          <w:rFonts w:ascii="Calibri" w:eastAsia="Calibri" w:hAnsi="Calibri" w:cs="Calibri"/>
+          <w:i/>
+          <w:iCs/>
+          <w:sz w:val="28"/>
+          <w:szCs w:val="28"/>
+          <w:lang w:val="da"/>
+        </w:rPr>
+        <w:t xml:space="preserve"> i rapport</w:t>
+      </w:r>
+      <w:r>
+        <w:rPr>
+          <w:rFonts w:ascii="Calibri" w:eastAsia="Calibri" w:hAnsi="Calibri" w:cs="Calibri"/>
+          <w:i/>
+          <w:iCs/>
+          <w:sz w:val="28"/>
+          <w:szCs w:val="28"/>
+          <w:lang w:val="da"/>
+        </w:rPr>
+        <w:t>”</w:t>
+      </w:r>
+      <w:r>
+        <w:rPr>
+          <w:rFonts w:ascii="Calibri" w:eastAsia="Calibri" w:hAnsi="Calibri" w:cs="Calibri"/>
+          <w:sz w:val="28"/>
+          <w:szCs w:val="28"/>
+          <w:lang w:val="da"/>
+        </w:rPr>
+        <w:t>? Hvorfor eller hvorfor ikke?</w:t>
+      </w:r>
+    </w:p>
+    <w:p>
+      <w:pPr>
+        <w:spacing w:after="0"/>
+        <w:ind w:left="105" w:right="180"/>
+        <w:rPr>
+          <w:rFonts w:ascii="Calibri" w:eastAsia="Calibri" w:hAnsi="Calibri" w:cs="Calibri"/>
+          <w:sz w:val="28"/>
+          <w:szCs w:val="28"/>
+          <w:lang w:val="da"/>
+        </w:rPr>
+      </w:pPr>
     </w:p>
     <w:sectPr>
-      <w:pgSz w:w="12240" w:h="15840" w:orient="portrait"/>
+      <w:pgSz w:w="12240" w:h="15840"/>
       <w:pgMar w:top="1440" w:right="1440" w:bottom="1440" w:left="1440" w:header="720" w:footer="720" w:gutter="0"/>
       <w:cols w:space="720"/>
       <w:docGrid w:linePitch="360"/>
@@ -840,8 +1386,234 @@
 </file>
 
 <file path=word/numbering.xml><?xml version="1.0" encoding="utf-8"?>
-<w:numbering xmlns:wpc="http://schemas.microsoft.com/office/word/2010/wordprocessingCanvas" xmlns:cx="http://schemas.microsoft.com/office/drawing/2014/chartex" xmlns:cx1="http://schemas.microsoft.com/office/drawing/2015/9/8/chartex" xmlns:cx2="http://schemas.microsoft.com/office/drawing/2015/10/21/chartex" xmlns:cx3="http://schemas.microsoft.com/office/drawing/2016/5/9/chartex" xmlns:cx4="http://schemas.microsoft.com/office/drawing/2016/5/10/chartex" xmlns:cx5="http://schemas.microsoft.com/office/drawing/2016/5/11/chartex" xmlns:cx6="http://schemas.microsoft.com/office/drawing/2016/5/12/chartex" xmlns:cx7="http://schemas.microsoft.com/office/drawing/2016/5/13/chartex" xmlns:cx8="http://schemas.microsoft.com/office/drawing/2016/5/14/chartex" xmlns:mc="http://schemas.openxmlformats.org/markup-compatibility/2006" xmlns:aink="http://schemas.microsoft.com/office/drawing/2016/ink" xmlns:am3d="http://schemas.microsoft.com/office/drawing/2017/model3d" xmlns:o="urn:schemas-microsoft-com:office:office" xmlns:oel="http://schemas.microsoft.com/office/2019/extlst" xmlns:r="http://schemas.openxmlformats.org/officeDocument/2006/relationships" xmlns:m="http://schemas.openxmlformats.org/officeDocument/2006/math" xmlns:v="urn:schemas-microsoft-com:vml" xmlns:wp14="http://schemas.microsoft.com/office/word/2010/wordprocessingDrawing" xmlns:wp="http://schemas.openxmlformats.org/drawingml/2006/wordprocessingDrawing" xmlns:w10="urn:schemas-microsoft-com:office:word" xmlns:w="http://schemas.openxmlformats.org/wordprocessingml/2006/main" xmlns:w14="http://schemas.microsoft.com/office/word/2010/wordml" xmlns:w15="http://schemas.microsoft.com/office/word/2012/wordml" xmlns:w16cex="http://schemas.microsoft.com/office/word/2018/wordml/cex" xmlns:w16cid="http://schemas.microsoft.com/office/word/2016/wordml/cid" xmlns:w16="http://schemas.microsoft.com/office/word/2018/wordml" xmlns:w16du="http://schemas.microsoft.com/office/word/2023/wordml/word16du" xmlns:w16sdtdh="http://schemas.microsoft.com/office/word/2020/wordml/sdtdatahash" xmlns:w16sdtfl="http://schemas.microsoft.com/office/word/2024/wordml/sdtformatlock" xmlns:w16se="http://schemas.microsoft.com/office/word/2015/wordml/symex" xmlns:wpg="http://schemas.microsoft.com/office/word/2010/wordprocessingGroup" xmlns:wpi="http://schemas.microsoft.com/office/word/2010/wordprocessingInk" xmlns:wne="http://schemas.microsoft.com/office/word/2006/wordml" xmlns:wps="http://schemas.microsoft.com/office/word/2010/wordprocessingShape" mc:Ignorable="w14 w15 w16se w16cid w16 w16cex w16sdtdh w16sdtfl w16du wp14">
+<w:numbering xmlns:wpc="http://schemas.microsoft.com/office/word/2010/wordprocessingCanvas" xmlns:cx="http://schemas.microsoft.com/office/drawing/2014/chartex" xmlns:cx1="http://schemas.microsoft.com/office/drawing/2015/9/8/chartex" xmlns:cx2="http://schemas.microsoft.com/office/drawing/2015/10/21/chartex" xmlns:cx3="http://schemas.microsoft.com/office/drawing/2016/5/9/chartex" xmlns:cx4="http://schemas.microsoft.com/office/drawing/2016/5/10/chartex" xmlns:cx5="http://schemas.microsoft.com/office/drawing/2016/5/11/chartex" xmlns:cx6="http://schemas.microsoft.com/office/drawing/2016/5/12/chartex" xmlns:cx7="http://schemas.microsoft.com/office/drawing/2016/5/13/chartex" xmlns:cx8="http://schemas.microsoft.com/office/drawing/2016/5/14/chartex" xmlns:mc="http://schemas.openxmlformats.org/markup-compatibility/2006" xmlns:m="http://schemas.openxmlformats.org/officeDocument/2006/math" xmlns:aink="http://schemas.microsoft.com/office/drawing/2016/ink" xmlns:am3d="http://schemas.microsoft.com/office/drawing/2017/model3d" xmlns:oel="http://schemas.microsoft.com/office/2019/extlst" xmlns:r="http://schemas.openxmlformats.org/officeDocument/2006/relationships" xmlns:wp14="http://schemas.microsoft.com/office/word/2010/wordprocessingDrawing" xmlns:wp="http://schemas.openxmlformats.org/drawingml/2006/wordprocessingDrawing" xmlns:wpg="http://schemas.microsoft.com/office/word/2010/wordprocessingGroup" xmlns:wpi="http://schemas.microsoft.com/office/word/2010/wordprocessingInk" xmlns:wps="http://schemas.microsoft.com/office/word/2010/wordprocessingShape" xmlns:o="urn:schemas-microsoft-com:office:office" xmlns:v="urn:schemas-microsoft-com:vml" xmlns:w10="urn:schemas-microsoft-com:office:word" xmlns:w="http://schemas.openxmlformats.org/wordprocessingml/2006/main" xmlns:w14="http://schemas.microsoft.com/office/word/2010/wordml" xmlns:w15="http://schemas.microsoft.com/office/word/2012/wordml" xmlns:w16cex="http://schemas.microsoft.com/office/word/2018/wordml/cex" xmlns:w16cid="http://schemas.microsoft.com/office/word/2016/wordml/cid" xmlns:w16="http://schemas.microsoft.com/office/word/2018/wordml" xmlns:w16sdtdh="http://schemas.microsoft.com/office/word/2020/wordml/sdtdatahash" xmlns:w16sdtfl="http://schemas.microsoft.com/office/word/2024/wordml/sdtformatlock" xmlns:w16se="http://schemas.microsoft.com/office/word/2015/wordml/symex" xmlns:w16du="http://schemas.microsoft.com/office/word/2023/wordml/word16du" xmlns:wne="http://schemas.microsoft.com/office/word/2006/wordml" mc:Ignorable="w14 w15 w16se w16cid w16 w16cex w16sdtdh w16sdtfl w16du wp14">
   <w:abstractNum w:abstractNumId="0" w15:restartNumberingAfterBreak="0">
+    <w:nsid w:val="114E1650"/>
+    <w:multiLevelType w:val="multilevel"/>
+    <w:tmpl w:val="80C8DD98"/>
+    <w:lvl w:ilvl="0">
+      <w:start w:val="1"/>
+      <w:numFmt w:val="decimal"/>
+      <w:lvlText w:val="%1."/>
+      <w:lvlJc w:val="left"/>
+      <w:pPr>
+        <w:tabs>
+          <w:tab w:val="num" w:pos="720"/>
+        </w:tabs>
+        <w:ind w:left="720" w:hanging="360"/>
+      </w:pPr>
+    </w:lvl>
+    <w:lvl w:ilvl="1" w:tentative="1">
+      <w:start w:val="1"/>
+      <w:numFmt w:val="decimal"/>
+      <w:lvlText w:val="%2."/>
+      <w:lvlJc w:val="left"/>
+      <w:pPr>
+        <w:tabs>
+          <w:tab w:val="num" w:pos="1440"/>
+        </w:tabs>
+        <w:ind w:left="1440" w:hanging="360"/>
+      </w:pPr>
+    </w:lvl>
+    <w:lvl w:ilvl="2" w:tentative="1">
+      <w:start w:val="1"/>
+      <w:numFmt w:val="decimal"/>
+      <w:lvlText w:val="%3."/>
+      <w:lvlJc w:val="left"/>
+      <w:pPr>
+        <w:tabs>
+          <w:tab w:val="num" w:pos="2160"/>
+        </w:tabs>
+        <w:ind w:left="2160" w:hanging="360"/>
+      </w:pPr>
+    </w:lvl>
+    <w:lvl w:ilvl="3" w:tentative="1">
+      <w:start w:val="1"/>
+      <w:numFmt w:val="decimal"/>
+      <w:lvlText w:val="%4."/>
+      <w:lvlJc w:val="left"/>
+      <w:pPr>
+        <w:tabs>
+          <w:tab w:val="num" w:pos="2880"/>
+        </w:tabs>
+        <w:ind w:left="2880" w:hanging="360"/>
+      </w:pPr>
+    </w:lvl>
+    <w:lvl w:ilvl="4" w:tentative="1">
+      <w:start w:val="1"/>
+      <w:numFmt w:val="decimal"/>
+      <w:lvlText w:val="%5."/>
+      <w:lvlJc w:val="left"/>
+      <w:pPr>
+        <w:tabs>
+          <w:tab w:val="num" w:pos="3600"/>
+        </w:tabs>
+        <w:ind w:left="3600" w:hanging="360"/>
+      </w:pPr>
+    </w:lvl>
+    <w:lvl w:ilvl="5" w:tentative="1">
+      <w:start w:val="1"/>
+      <w:numFmt w:val="decimal"/>
+      <w:lvlText w:val="%6."/>
+      <w:lvlJc w:val="left"/>
+      <w:pPr>
+        <w:tabs>
+          <w:tab w:val="num" w:pos="4320"/>
+        </w:tabs>
+        <w:ind w:left="4320" w:hanging="360"/>
+      </w:pPr>
+    </w:lvl>
+    <w:lvl w:ilvl="6" w:tentative="1">
+      <w:start w:val="1"/>
+      <w:numFmt w:val="decimal"/>
+      <w:lvlText w:val="%7."/>
+      <w:lvlJc w:val="left"/>
+      <w:pPr>
+        <w:tabs>
+          <w:tab w:val="num" w:pos="5040"/>
+        </w:tabs>
+        <w:ind w:left="5040" w:hanging="360"/>
+      </w:pPr>
+    </w:lvl>
+    <w:lvl w:ilvl="7" w:tentative="1">
+      <w:start w:val="1"/>
+      <w:numFmt w:val="decimal"/>
+      <w:lvlText w:val="%8."/>
+      <w:lvlJc w:val="left"/>
+      <w:pPr>
+        <w:tabs>
+          <w:tab w:val="num" w:pos="5760"/>
+        </w:tabs>
+        <w:ind w:left="5760" w:hanging="360"/>
+      </w:pPr>
+    </w:lvl>
+    <w:lvl w:ilvl="8" w:tentative="1">
+      <w:start w:val="1"/>
+      <w:numFmt w:val="decimal"/>
+      <w:lvlText w:val="%9."/>
+      <w:lvlJc w:val="left"/>
+      <w:pPr>
+        <w:tabs>
+          <w:tab w:val="num" w:pos="6480"/>
+        </w:tabs>
+        <w:ind w:left="6480" w:hanging="360"/>
+      </w:pPr>
+    </w:lvl>
+  </w:abstractNum>
+  <w:abstractNum w:abstractNumId="1" w15:restartNumberingAfterBreak="0">
+    <w:nsid w:val="31CF1160"/>
+    <w:multiLevelType w:val="multilevel"/>
+    <w:tmpl w:val="786656E8"/>
+    <w:lvl w:ilvl="0">
+      <w:start w:val="1"/>
+      <w:numFmt w:val="decimal"/>
+      <w:lvlText w:val="%1."/>
+      <w:lvlJc w:val="left"/>
+      <w:pPr>
+        <w:tabs>
+          <w:tab w:val="num" w:pos="720"/>
+        </w:tabs>
+        <w:ind w:left="720" w:hanging="360"/>
+      </w:pPr>
+    </w:lvl>
+    <w:lvl w:ilvl="1" w:tentative="1">
+      <w:start w:val="1"/>
+      <w:numFmt w:val="decimal"/>
+      <w:lvlText w:val="%2."/>
+      <w:lvlJc w:val="left"/>
+      <w:pPr>
+        <w:tabs>
+          <w:tab w:val="num" w:pos="1440"/>
+        </w:tabs>
+        <w:ind w:left="1440" w:hanging="360"/>
+      </w:pPr>
+    </w:lvl>
+    <w:lvl w:ilvl="2" w:tentative="1">
+      <w:start w:val="1"/>
+      <w:numFmt w:val="decimal"/>
+      <w:lvlText w:val="%3."/>
+      <w:lvlJc w:val="left"/>
+      <w:pPr>
+        <w:tabs>
+          <w:tab w:val="num" w:pos="2160"/>
+        </w:tabs>
+        <w:ind w:left="2160" w:hanging="360"/>
+      </w:pPr>
+    </w:lvl>
+    <w:lvl w:ilvl="3" w:tentative="1">
+      <w:start w:val="1"/>
+      <w:numFmt w:val="decimal"/>
+      <w:lvlText w:val="%4."/>
+      <w:lvlJc w:val="left"/>
+      <w:pPr>
+        <w:tabs>
+          <w:tab w:val="num" w:pos="2880"/>
+        </w:tabs>
+        <w:ind w:left="2880" w:hanging="360"/>
+      </w:pPr>
+    </w:lvl>
+    <w:lvl w:ilvl="4" w:tentative="1">
+      <w:start w:val="1"/>
+      <w:numFmt w:val="decimal"/>
+      <w:lvlText w:val="%5."/>
+      <w:lvlJc w:val="left"/>
+      <w:pPr>
+        <w:tabs>
+          <w:tab w:val="num" w:pos="3600"/>
+        </w:tabs>
+        <w:ind w:left="3600" w:hanging="360"/>
+      </w:pPr>
+    </w:lvl>
+    <w:lvl w:ilvl="5" w:tentative="1">
+      <w:start w:val="1"/>
+      <w:numFmt w:val="decimal"/>
+      <w:lvlText w:val="%6."/>
+      <w:lvlJc w:val="left"/>
+      <w:pPr>
+        <w:tabs>
+          <w:tab w:val="num" w:pos="4320"/>
+        </w:tabs>
+        <w:ind w:left="4320" w:hanging="360"/>
+      </w:pPr>
+    </w:lvl>
+    <w:lvl w:ilvl="6" w:tentative="1">
+      <w:start w:val="1"/>
+      <w:numFmt w:val="decimal"/>
+      <w:lvlText w:val="%7."/>
+      <w:lvlJc w:val="left"/>
+      <w:pPr>
+        <w:tabs>
+          <w:tab w:val="num" w:pos="5040"/>
+        </w:tabs>
+        <w:ind w:left="5040" w:hanging="360"/>
+      </w:pPr>
+    </w:lvl>
+    <w:lvl w:ilvl="7" w:tentative="1">
+      <w:start w:val="1"/>
+      <w:numFmt w:val="decimal"/>
+      <w:lvlText w:val="%8."/>
+      <w:lvlJc w:val="left"/>
+      <w:pPr>
+        <w:tabs>
+          <w:tab w:val="num" w:pos="5760"/>
+        </w:tabs>
+        <w:ind w:left="5760" w:hanging="360"/>
+      </w:pPr>
+    </w:lvl>
+    <w:lvl w:ilvl="8" w:tentative="1">
+      <w:start w:val="1"/>
+      <w:numFmt w:val="decimal"/>
+      <w:lvlText w:val="%9."/>
+      <w:lvlJc w:val="left"/>
+      <w:pPr>
+        <w:tabs>
+          <w:tab w:val="num" w:pos="6480"/>
+        </w:tabs>
+        <w:ind w:left="6480" w:hanging="360"/>
+      </w:pPr>
+    </w:lvl>
+  </w:abstractNum>
+  <w:abstractNum w:abstractNumId="2" w15:restartNumberingAfterBreak="0">
     <w:nsid w:val="3C082189"/>
     <w:multiLevelType w:val="hybridMultilevel"/>
     <w:tmpl w:val="4CB6501C"/>
@@ -854,7 +1626,7 @@
         <w:ind w:left="720" w:hanging="360"/>
       </w:pPr>
       <w:rPr>
-        <w:rFonts w:hint="default" w:ascii="Symbol" w:hAnsi="Symbol"/>
+        <w:rFonts w:ascii="Symbol" w:hAnsi="Symbol" w:hint="default"/>
       </w:rPr>
     </w:lvl>
     <w:lvl w:ilvl="1" w:tplc="1B701712">
@@ -866,7 +1638,7 @@
         <w:ind w:left="1440" w:hanging="360"/>
       </w:pPr>
       <w:rPr>
-        <w:rFonts w:hint="default" w:ascii="Courier New" w:hAnsi="Courier New"/>
+        <w:rFonts w:ascii="Courier New" w:hAnsi="Courier New" w:hint="default"/>
       </w:rPr>
     </w:lvl>
     <w:lvl w:ilvl="2" w:tplc="61C8A346">
@@ -878,7 +1650,7 @@
         <w:ind w:left="2160" w:hanging="360"/>
       </w:pPr>
       <w:rPr>
-        <w:rFonts w:hint="default" w:ascii="Wingdings" w:hAnsi="Wingdings"/>
+        <w:rFonts w:ascii="Wingdings" w:hAnsi="Wingdings" w:hint="default"/>
       </w:rPr>
     </w:lvl>
     <w:lvl w:ilvl="3" w:tplc="486E2328">
@@ -890,7 +1662,7 @@
         <w:ind w:left="2880" w:hanging="360"/>
       </w:pPr>
       <w:rPr>
-        <w:rFonts w:hint="default" w:ascii="Symbol" w:hAnsi="Symbol"/>
+        <w:rFonts w:ascii="Symbol" w:hAnsi="Symbol" w:hint="default"/>
       </w:rPr>
     </w:lvl>
     <w:lvl w:ilvl="4" w:tplc="23B2EB6C">
@@ -902,7 +1674,7 @@
         <w:ind w:left="3600" w:hanging="360"/>
       </w:pPr>
       <w:rPr>
-        <w:rFonts w:hint="default" w:ascii="Courier New" w:hAnsi="Courier New"/>
+        <w:rFonts w:ascii="Courier New" w:hAnsi="Courier New" w:hint="default"/>
       </w:rPr>
     </w:lvl>
     <w:lvl w:ilvl="5" w:tplc="26CEEFF2">
@@ -914,7 +1686,7 @@
         <w:ind w:left="4320" w:hanging="360"/>
       </w:pPr>
       <w:rPr>
-        <w:rFonts w:hint="default" w:ascii="Wingdings" w:hAnsi="Wingdings"/>
+        <w:rFonts w:ascii="Wingdings" w:hAnsi="Wingdings" w:hint="default"/>
       </w:rPr>
     </w:lvl>
     <w:lvl w:ilvl="6" w:tplc="DCE4A0DC">
@@ -926,7 +1698,7 @@
         <w:ind w:left="5040" w:hanging="360"/>
       </w:pPr>
       <w:rPr>
-        <w:rFonts w:hint="default" w:ascii="Symbol" w:hAnsi="Symbol"/>
+        <w:rFonts w:ascii="Symbol" w:hAnsi="Symbol" w:hint="default"/>
       </w:rPr>
     </w:lvl>
     <w:lvl w:ilvl="7" w:tplc="949A53AE">
@@ -938,7 +1710,7 @@
         <w:ind w:left="5760" w:hanging="360"/>
       </w:pPr>
       <w:rPr>
-        <w:rFonts w:hint="default" w:ascii="Courier New" w:hAnsi="Courier New"/>
+        <w:rFonts w:ascii="Courier New" w:hAnsi="Courier New" w:hint="default"/>
       </w:rPr>
     </w:lvl>
     <w:lvl w:ilvl="8" w:tplc="C8E464E8">
@@ -950,11 +1722,124 @@
         <w:ind w:left="6480" w:hanging="360"/>
       </w:pPr>
       <w:rPr>
-        <w:rFonts w:hint="default" w:ascii="Wingdings" w:hAnsi="Wingdings"/>
+        <w:rFonts w:ascii="Wingdings" w:hAnsi="Wingdings" w:hint="default"/>
       </w:rPr>
     </w:lvl>
   </w:abstractNum>
-  <w:abstractNum w:abstractNumId="1" w15:restartNumberingAfterBreak="0">
+  <w:abstractNum w:abstractNumId="3" w15:restartNumberingAfterBreak="0">
+    <w:nsid w:val="463D5F7D"/>
+    <w:multiLevelType w:val="multilevel"/>
+    <w:tmpl w:val="03426F94"/>
+    <w:lvl w:ilvl="0">
+      <w:start w:val="2"/>
+      <w:numFmt w:val="decimal"/>
+      <w:lvlText w:val="%1."/>
+      <w:lvlJc w:val="left"/>
+      <w:pPr>
+        <w:tabs>
+          <w:tab w:val="num" w:pos="720"/>
+        </w:tabs>
+        <w:ind w:left="720" w:hanging="360"/>
+      </w:pPr>
+    </w:lvl>
+    <w:lvl w:ilvl="1" w:tentative="1">
+      <w:start w:val="1"/>
+      <w:numFmt w:val="decimal"/>
+      <w:lvlText w:val="%2."/>
+      <w:lvlJc w:val="left"/>
+      <w:pPr>
+        <w:tabs>
+          <w:tab w:val="num" w:pos="1440"/>
+        </w:tabs>
+        <w:ind w:left="1440" w:hanging="360"/>
+      </w:pPr>
+    </w:lvl>
+    <w:lvl w:ilvl="2" w:tentative="1">
+      <w:start w:val="1"/>
+      <w:numFmt w:val="decimal"/>
+      <w:lvlText w:val="%3."/>
+      <w:lvlJc w:val="left"/>
+      <w:pPr>
+        <w:tabs>
+          <w:tab w:val="num" w:pos="2160"/>
+        </w:tabs>
+        <w:ind w:left="2160" w:hanging="360"/>
+      </w:pPr>
+    </w:lvl>
+    <w:lvl w:ilvl="3" w:tentative="1">
+      <w:start w:val="1"/>
+      <w:numFmt w:val="decimal"/>
+      <w:lvlText w:val="%4."/>
+      <w:lvlJc w:val="left"/>
+      <w:pPr>
+        <w:tabs>
+          <w:tab w:val="num" w:pos="2880"/>
+        </w:tabs>
+        <w:ind w:left="2880" w:hanging="360"/>
+      </w:pPr>
+    </w:lvl>
+    <w:lvl w:ilvl="4" w:tentative="1">
+      <w:start w:val="1"/>
+      <w:numFmt w:val="decimal"/>
+      <w:lvlText w:val="%5."/>
+      <w:lvlJc w:val="left"/>
+      <w:pPr>
+        <w:tabs>
+          <w:tab w:val="num" w:pos="3600"/>
+        </w:tabs>
+        <w:ind w:left="3600" w:hanging="360"/>
+      </w:pPr>
+    </w:lvl>
+    <w:lvl w:ilvl="5" w:tentative="1">
+      <w:start w:val="1"/>
+      <w:numFmt w:val="decimal"/>
+      <w:lvlText w:val="%6."/>
+      <w:lvlJc w:val="left"/>
+      <w:pPr>
+        <w:tabs>
+          <w:tab w:val="num" w:pos="4320"/>
+        </w:tabs>
+        <w:ind w:left="4320" w:hanging="360"/>
+      </w:pPr>
+    </w:lvl>
+    <w:lvl w:ilvl="6" w:tentative="1">
+      <w:start w:val="1"/>
+      <w:numFmt w:val="decimal"/>
+      <w:lvlText w:val="%7."/>
+      <w:lvlJc w:val="left"/>
+      <w:pPr>
+        <w:tabs>
+          <w:tab w:val="num" w:pos="5040"/>
+        </w:tabs>
+        <w:ind w:left="5040" w:hanging="360"/>
+      </w:pPr>
+    </w:lvl>
+    <w:lvl w:ilvl="7" w:tentative="1">
+      <w:start w:val="1"/>
+      <w:numFmt w:val="decimal"/>
+      <w:lvlText w:val="%8."/>
+      <w:lvlJc w:val="left"/>
+      <w:pPr>
+        <w:tabs>
+          <w:tab w:val="num" w:pos="5760"/>
+        </w:tabs>
+        <w:ind w:left="5760" w:hanging="360"/>
+      </w:pPr>
+    </w:lvl>
+    <w:lvl w:ilvl="8" w:tentative="1">
+      <w:start w:val="1"/>
+      <w:numFmt w:val="decimal"/>
+      <w:lvlText w:val="%9."/>
+      <w:lvlJc w:val="left"/>
+      <w:pPr>
+        <w:tabs>
+          <w:tab w:val="num" w:pos="6480"/>
+        </w:tabs>
+        <w:ind w:left="6480" w:hanging="360"/>
+      </w:pPr>
+    </w:lvl>
+  </w:abstractNum>
+  <w:abstractNum w:abstractNumId="4" w15:restartNumberingAfterBreak="0">
     <w:nsid w:val="6123B964"/>
     <w:multiLevelType w:val="hybridMultilevel"/>
     <w:tmpl w:val="FFFFFFFF"/>
@@ -967,7 +1852,7 @@
         <w:ind w:left="720" w:hanging="360"/>
       </w:pPr>
       <w:rPr>
-        <w:rFonts w:hint="default" w:ascii="Symbol" w:hAnsi="Symbol"/>
+        <w:rFonts w:ascii="Symbol" w:hAnsi="Symbol" w:hint="default"/>
       </w:rPr>
     </w:lvl>
     <w:lvl w:ilvl="1" w:tplc="E7FE9D32">
@@ -979,7 +1864,7 @@
         <w:ind w:left="1440" w:hanging="360"/>
       </w:pPr>
       <w:rPr>
-        <w:rFonts w:hint="default" w:ascii="Courier New" w:hAnsi="Courier New"/>
+        <w:rFonts w:ascii="Courier New" w:hAnsi="Courier New" w:hint="default"/>
       </w:rPr>
     </w:lvl>
     <w:lvl w:ilvl="2" w:tplc="F4C6FB46">
@@ -991,7 +1876,7 @@
         <w:ind w:left="2160" w:hanging="360"/>
       </w:pPr>
       <w:rPr>
-        <w:rFonts w:hint="default" w:ascii="Wingdings" w:hAnsi="Wingdings"/>
+        <w:rFonts w:ascii="Wingdings" w:hAnsi="Wingdings" w:hint="default"/>
       </w:rPr>
     </w:lvl>
     <w:lvl w:ilvl="3" w:tplc="44A00C20">
@@ -1003,7 +1888,7 @@
         <w:ind w:left="2880" w:hanging="360"/>
       </w:pPr>
       <w:rPr>
-        <w:rFonts w:hint="default" w:ascii="Symbol" w:hAnsi="Symbol"/>
+        <w:rFonts w:ascii="Symbol" w:hAnsi="Symbol" w:hint="default"/>
       </w:rPr>
     </w:lvl>
     <w:lvl w:ilvl="4" w:tplc="66CE82DE">
@@ -1015,7 +1900,7 @@
         <w:ind w:left="3600" w:hanging="360"/>
       </w:pPr>
       <w:rPr>
-        <w:rFonts w:hint="default" w:ascii="Courier New" w:hAnsi="Courier New"/>
+        <w:rFonts w:ascii="Courier New" w:hAnsi="Courier New" w:hint="default"/>
       </w:rPr>
     </w:lvl>
     <w:lvl w:ilvl="5" w:tplc="FF68F04A">
@@ -1027,7 +1912,7 @@
         <w:ind w:left="4320" w:hanging="360"/>
       </w:pPr>
       <w:rPr>
-        <w:rFonts w:hint="default" w:ascii="Wingdings" w:hAnsi="Wingdings"/>
+        <w:rFonts w:ascii="Wingdings" w:hAnsi="Wingdings" w:hint="default"/>
       </w:rPr>
     </w:lvl>
     <w:lvl w:ilvl="6" w:tplc="C70CC52E">
@@ -1039,7 +1924,7 @@
         <w:ind w:left="5040" w:hanging="360"/>
       </w:pPr>
       <w:rPr>
-        <w:rFonts w:hint="default" w:ascii="Symbol" w:hAnsi="Symbol"/>
+        <w:rFonts w:ascii="Symbol" w:hAnsi="Symbol" w:hint="default"/>
       </w:rPr>
     </w:lvl>
     <w:lvl w:ilvl="7" w:tplc="F752C20E">
@@ -1051,7 +1936,7 @@
         <w:ind w:left="5760" w:hanging="360"/>
       </w:pPr>
       <w:rPr>
-        <w:rFonts w:hint="default" w:ascii="Courier New" w:hAnsi="Courier New"/>
+        <w:rFonts w:ascii="Courier New" w:hAnsi="Courier New" w:hint="default"/>
       </w:rPr>
     </w:lvl>
     <w:lvl w:ilvl="8" w:tplc="389E5B10">
@@ -1063,11 +1948,11 @@
         <w:ind w:left="6480" w:hanging="360"/>
       </w:pPr>
       <w:rPr>
-        <w:rFonts w:hint="default" w:ascii="Wingdings" w:hAnsi="Wingdings"/>
+        <w:rFonts w:ascii="Wingdings" w:hAnsi="Wingdings" w:hint="default"/>
       </w:rPr>
     </w:lvl>
   </w:abstractNum>
-  <w:abstractNum w:abstractNumId="2" w15:restartNumberingAfterBreak="0">
+  <w:abstractNum w:abstractNumId="5" w15:restartNumberingAfterBreak="0">
     <w:nsid w:val="79130BB2"/>
     <w:multiLevelType w:val="hybridMultilevel"/>
     <w:tmpl w:val="7E3EAE3A"/>
@@ -1080,7 +1965,7 @@
         <w:ind w:left="720" w:hanging="360"/>
       </w:pPr>
       <w:rPr>
-        <w:rFonts w:hint="default" w:ascii="Symbol" w:hAnsi="Symbol"/>
+        <w:rFonts w:ascii="Symbol" w:hAnsi="Symbol" w:hint="default"/>
       </w:rPr>
     </w:lvl>
     <w:lvl w:ilvl="1" w:tplc="170CA782">
@@ -1092,7 +1977,7 @@
         <w:ind w:left="1440" w:hanging="360"/>
       </w:pPr>
       <w:rPr>
-        <w:rFonts w:hint="default" w:ascii="Courier New" w:hAnsi="Courier New"/>
+        <w:rFonts w:ascii="Courier New" w:hAnsi="Courier New" w:hint="default"/>
       </w:rPr>
     </w:lvl>
     <w:lvl w:ilvl="2" w:tplc="BD866276">
@@ -1104,7 +1989,7 @@
         <w:ind w:left="2160" w:hanging="360"/>
       </w:pPr>
       <w:rPr>
-        <w:rFonts w:hint="default" w:ascii="Wingdings" w:hAnsi="Wingdings"/>
+        <w:rFonts w:ascii="Wingdings" w:hAnsi="Wingdings" w:hint="default"/>
       </w:rPr>
     </w:lvl>
     <w:lvl w:ilvl="3" w:tplc="B016C51E">
@@ -1116,7 +2001,7 @@
         <w:ind w:left="2880" w:hanging="360"/>
       </w:pPr>
       <w:rPr>
-        <w:rFonts w:hint="default" w:ascii="Symbol" w:hAnsi="Symbol"/>
+        <w:rFonts w:ascii="Symbol" w:hAnsi="Symbol" w:hint="default"/>
       </w:rPr>
     </w:lvl>
     <w:lvl w:ilvl="4" w:tplc="826CCD78">
@@ -1128,7 +2013,7 @@
         <w:ind w:left="3600" w:hanging="360"/>
       </w:pPr>
       <w:rPr>
-        <w:rFonts w:hint="default" w:ascii="Courier New" w:hAnsi="Courier New"/>
+        <w:rFonts w:ascii="Courier New" w:hAnsi="Courier New" w:hint="default"/>
       </w:rPr>
     </w:lvl>
     <w:lvl w:ilvl="5" w:tplc="EC120F42">
@@ -1140,7 +2025,7 @@
         <w:ind w:left="4320" w:hanging="360"/>
       </w:pPr>
       <w:rPr>
-        <w:rFonts w:hint="default" w:ascii="Wingdings" w:hAnsi="Wingdings"/>
+        <w:rFonts w:ascii="Wingdings" w:hAnsi="Wingdings" w:hint="default"/>
       </w:rPr>
     </w:lvl>
     <w:lvl w:ilvl="6" w:tplc="D6C4B6D4">
@@ -1152,7 +2037,7 @@
         <w:ind w:left="5040" w:hanging="360"/>
       </w:pPr>
       <w:rPr>
-        <w:rFonts w:hint="default" w:ascii="Symbol" w:hAnsi="Symbol"/>
+        <w:rFonts w:ascii="Symbol" w:hAnsi="Symbol" w:hint="default"/>
       </w:rPr>
     </w:lvl>
     <w:lvl w:ilvl="7" w:tplc="7BC82F62">
@@ -1164,7 +2049,7 @@
         <w:ind w:left="5760" w:hanging="360"/>
       </w:pPr>
       <w:rPr>
-        <w:rFonts w:hint="default" w:ascii="Courier New" w:hAnsi="Courier New"/>
+        <w:rFonts w:ascii="Courier New" w:hAnsi="Courier New" w:hint="default"/>
       </w:rPr>
     </w:lvl>
     <w:lvl w:ilvl="8" w:tplc="19D439D2">
@@ -1176,28 +2061,37 @@
         <w:ind w:left="6480" w:hanging="360"/>
       </w:pPr>
       <w:rPr>
-        <w:rFonts w:hint="default" w:ascii="Wingdings" w:hAnsi="Wingdings"/>
+        <w:rFonts w:ascii="Wingdings" w:hAnsi="Wingdings" w:hint="default"/>
       </w:rPr>
     </w:lvl>
   </w:abstractNum>
   <w:num w:numId="1" w16cid:durableId="1125274223">
+    <w:abstractNumId w:val="4"/>
+  </w:num>
+  <w:num w:numId="2" w16cid:durableId="440153080">
+    <w:abstractNumId w:val="5"/>
+  </w:num>
+  <w:num w:numId="3" w16cid:durableId="648553857">
+    <w:abstractNumId w:val="2"/>
+  </w:num>
+  <w:num w:numId="4" w16cid:durableId="1546718483">
+    <w:abstractNumId w:val="0"/>
+  </w:num>
+  <w:num w:numId="5" w16cid:durableId="764149904">
     <w:abstractNumId w:val="1"/>
   </w:num>
-  <w:num w:numId="2" w16cid:durableId="440153080">
-    <w:abstractNumId w:val="2"/>
-  </w:num>
-  <w:num w:numId="3" w16cid:durableId="648553857">
-    <w:abstractNumId w:val="0"/>
+  <w:num w:numId="6" w16cid:durableId="1886017289">
+    <w:abstractNumId w:val="3"/>
   </w:num>
 </w:numbering>
 </file>
 
 <file path=word/styles.xml><?xml version="1.0" encoding="utf-8"?>
-<w:styles xmlns:mc="http://schemas.openxmlformats.org/markup-compatibility/2006" xmlns:r="http://schemas.openxmlformats.org/officeDocument/2006/relationships" xmlns:w="http://schemas.openxmlformats.org/wordprocessingml/2006/main" xmlns:w14="http://schemas.microsoft.com/office/word/2010/wordml" xmlns:w15="http://schemas.microsoft.com/office/word/2012/wordml" xmlns:w16cex="http://schemas.microsoft.com/office/word/2018/wordml/cex" xmlns:w16cid="http://schemas.microsoft.com/office/word/2016/wordml/cid" xmlns:w16="http://schemas.microsoft.com/office/word/2018/wordml" xmlns:w16du="http://schemas.microsoft.com/office/word/2023/wordml/word16du" xmlns:w16sdtdh="http://schemas.microsoft.com/office/word/2020/wordml/sdtdatahash" xmlns:w16sdtfl="http://schemas.microsoft.com/office/word/2024/wordml/sdtformatlock" xmlns:w16se="http://schemas.microsoft.com/office/word/2015/wordml/symex" mc:Ignorable="w14 w15 w16se w16cid w16 w16cex w16sdtdh w16sdtfl w16du">
+<w:styles xmlns:mc="http://schemas.openxmlformats.org/markup-compatibility/2006" xmlns:r="http://schemas.openxmlformats.org/officeDocument/2006/relationships" xmlns:w="http://schemas.openxmlformats.org/wordprocessingml/2006/main" xmlns:w14="http://schemas.microsoft.com/office/word/2010/wordml" xmlns:w15="http://schemas.microsoft.com/office/word/2012/wordml" xmlns:w16cex="http://schemas.microsoft.com/office/word/2018/wordml/cex" xmlns:w16cid="http://schemas.microsoft.com/office/word/2016/wordml/cid" xmlns:w16="http://schemas.microsoft.com/office/word/2018/wordml" xmlns:w16sdtdh="http://schemas.microsoft.com/office/word/2020/wordml/sdtdatahash" xmlns:w16sdtfl="http://schemas.microsoft.com/office/word/2024/wordml/sdtformatlock" xmlns:w16se="http://schemas.microsoft.com/office/word/2015/wordml/symex" xmlns:w16du="http://schemas.microsoft.com/office/word/2023/wordml/word16du" mc:Ignorable="w14 w15 w16se w16cid w16 w16cex w16sdtdh w16sdtfl w16du">
   <w:docDefaults>
     <w:rPrDefault>
       <w:rPr>
-        <w:rFonts w:asciiTheme="minorHAnsi" w:hAnsiTheme="minorHAnsi" w:eastAsiaTheme="minorEastAsia" w:cstheme="minorBidi"/>
+        <w:rFonts w:asciiTheme="minorHAnsi" w:eastAsiaTheme="minorEastAsia" w:hAnsiTheme="minorHAnsi" w:cstheme="minorBidi"/>
         <w:sz w:val="24"/>
         <w:szCs w:val="24"/>
         <w:lang w:val="en-US" w:eastAsia="ja-JP" w:bidi="ar-SA"/>
@@ -1212,14 +2106,14 @@
   <w:latentStyles w:defLockedState="0" w:defUIPriority="99" w:defSemiHidden="0" w:defUnhideWhenUsed="0" w:defQFormat="0" w:count="376">
     <w:lsdException w:name="Normal" w:uiPriority="0" w:qFormat="1"/>
     <w:lsdException w:name="heading 1" w:uiPriority="9" w:qFormat="1"/>
-    <w:lsdException w:name="heading 2" w:uiPriority="9" w:semiHidden="1" w:unhideWhenUsed="1" w:qFormat="1"/>
-    <w:lsdException w:name="heading 3" w:uiPriority="9" w:semiHidden="1" w:unhideWhenUsed="1" w:qFormat="1"/>
-    <w:lsdException w:name="heading 4" w:uiPriority="9" w:semiHidden="1" w:unhideWhenUsed="1" w:qFormat="1"/>
-    <w:lsdException w:name="heading 5" w:uiPriority="9" w:semiHidden="1" w:unhideWhenUsed="1" w:qFormat="1"/>
-    <w:lsdException w:name="heading 6" w:uiPriority="9" w:semiHidden="1" w:unhideWhenUsed="1" w:qFormat="1"/>
-    <w:lsdException w:name="heading 7" w:uiPriority="9" w:semiHidden="1" w:unhideWhenUsed="1" w:qFormat="1"/>
-    <w:lsdException w:name="heading 8" w:uiPriority="9" w:semiHidden="1" w:unhideWhenUsed="1" w:qFormat="1"/>
-    <w:lsdException w:name="heading 9" w:uiPriority="9" w:semiHidden="1" w:unhideWhenUsed="1" w:qFormat="1"/>
+    <w:lsdException w:name="heading 2" w:semiHidden="1" w:uiPriority="9" w:unhideWhenUsed="1" w:qFormat="1"/>
+    <w:lsdException w:name="heading 3" w:semiHidden="1" w:uiPriority="9" w:unhideWhenUsed="1" w:qFormat="1"/>
+    <w:lsdException w:name="heading 4" w:semiHidden="1" w:uiPriority="9" w:unhideWhenUsed="1" w:qFormat="1"/>
+    <w:lsdException w:name="heading 5" w:semiHidden="1" w:uiPriority="9" w:unhideWhenUsed="1" w:qFormat="1"/>
+    <w:lsdException w:name="heading 6" w:semiHidden="1" w:uiPriority="9" w:unhideWhenUsed="1" w:qFormat="1"/>
+    <w:lsdException w:name="heading 7" w:semiHidden="1" w:uiPriority="9" w:unhideWhenUsed="1" w:qFormat="1"/>
+    <w:lsdException w:name="heading 8" w:semiHidden="1" w:uiPriority="9" w:unhideWhenUsed="1" w:qFormat="1"/>
+    <w:lsdException w:name="heading 9" w:semiHidden="1" w:uiPriority="9" w:unhideWhenUsed="1" w:qFormat="1"/>
     <w:lsdException w:name="index 1" w:semiHidden="1" w:unhideWhenUsed="1"/>
     <w:lsdException w:name="index 2" w:semiHidden="1" w:unhideWhenUsed="1"/>
     <w:lsdException w:name="index 3" w:semiHidden="1" w:unhideWhenUsed="1"/>
@@ -1229,22 +2123,22 @@
     <w:lsdException w:name="index 7" w:semiHidden="1" w:unhideWhenUsed="1"/>
     <w:lsdException w:name="index 8" w:semiHidden="1" w:unhideWhenUsed="1"/>
     <w:lsdException w:name="index 9" w:semiHidden="1" w:unhideWhenUsed="1"/>
-    <w:lsdException w:name="toc 1" w:uiPriority="39" w:semiHidden="1" w:unhideWhenUsed="1"/>
-    <w:lsdException w:name="toc 2" w:uiPriority="39" w:semiHidden="1" w:unhideWhenUsed="1"/>
-    <w:lsdException w:name="toc 3" w:uiPriority="39" w:semiHidden="1" w:unhideWhenUsed="1"/>
-    <w:lsdException w:name="toc 4" w:uiPriority="39" w:semiHidden="1" w:unhideWhenUsed="1"/>
-    <w:lsdException w:name="toc 5" w:uiPriority="39" w:semiHidden="1" w:unhideWhenUsed="1"/>
-    <w:lsdException w:name="toc 6" w:uiPriority="39" w:semiHidden="1" w:unhideWhenUsed="1"/>
-    <w:lsdException w:name="toc 7" w:uiPriority="39" w:semiHidden="1" w:unhideWhenUsed="1"/>
-    <w:lsdException w:name="toc 8" w:uiPriority="39" w:semiHidden="1" w:unhideWhenUsed="1"/>
-    <w:lsdException w:name="toc 9" w:uiPriority="39" w:semiHidden="1" w:unhideWhenUsed="1"/>
+    <w:lsdException w:name="toc 1" w:semiHidden="1" w:uiPriority="39" w:unhideWhenUsed="1"/>
+    <w:lsdException w:name="toc 2" w:semiHidden="1" w:uiPriority="39" w:unhideWhenUsed="1"/>
+    <w:lsdException w:name="toc 3" w:semiHidden="1" w:uiPriority="39" w:unhideWhenUsed="1"/>
+    <w:lsdException w:name="toc 4" w:semiHidden="1" w:uiPriority="39" w:unhideWhenUsed="1"/>
+    <w:lsdException w:name="toc 5" w:semiHidden="1" w:uiPriority="39" w:unhideWhenUsed="1"/>
+    <w:lsdException w:name="toc 6" w:semiHidden="1" w:uiPriority="39" w:unhideWhenUsed="1"/>
+    <w:lsdException w:name="toc 7" w:semiHidden="1" w:uiPriority="39" w:unhideWhenUsed="1"/>
+    <w:lsdException w:name="toc 8" w:semiHidden="1" w:uiPriority="39" w:unhideWhenUsed="1"/>
+    <w:lsdException w:name="toc 9" w:semiHidden="1" w:uiPriority="39" w:unhideWhenUsed="1"/>
     <w:lsdException w:name="Normal Indent" w:semiHidden="1" w:unhideWhenUsed="1"/>
     <w:lsdException w:name="footnote text" w:semiHidden="1" w:unhideWhenUsed="1"/>
     <w:lsdException w:name="annotation text" w:semiHidden="1" w:unhideWhenUsed="1"/>
     <w:lsdException w:name="header" w:semiHidden="1" w:unhideWhenUsed="1"/>
     <w:lsdException w:name="footer" w:semiHidden="1" w:unhideWhenUsed="1"/>
     <w:lsdException w:name="index heading" w:semiHidden="1" w:unhideWhenUsed="1"/>
-    <w:lsdException w:name="caption" w:uiPriority="35" w:semiHidden="1" w:unhideWhenUsed="1" w:qFormat="1"/>
+    <w:lsdException w:name="caption" w:semiHidden="1" w:uiPriority="35" w:unhideWhenUsed="1" w:qFormat="1"/>
     <w:lsdException w:name="table of figures" w:semiHidden="1" w:unhideWhenUsed="1"/>
     <w:lsdException w:name="envelope address" w:semiHidden="1" w:unhideWhenUsed="1"/>
     <w:lsdException w:name="envelope return" w:semiHidden="1" w:unhideWhenUsed="1"/>
@@ -1275,7 +2169,7 @@
     <w:lsdException w:name="Title" w:uiPriority="10" w:qFormat="1"/>
     <w:lsdException w:name="Closing" w:semiHidden="1" w:unhideWhenUsed="1"/>
     <w:lsdException w:name="Signature" w:semiHidden="1" w:unhideWhenUsed="1"/>
-    <w:lsdException w:name="Default Paragraph Font" w:uiPriority="1" w:semiHidden="1" w:unhideWhenUsed="1"/>
+    <w:lsdException w:name="Default Paragraph Font" w:semiHidden="1" w:uiPriority="1" w:unhideWhenUsed="1"/>
     <w:lsdException w:name="Body Text" w:semiHidden="1" w:unhideWhenUsed="1"/>
     <w:lsdException w:name="Body Text Indent" w:semiHidden="1" w:unhideWhenUsed="1"/>
     <w:lsdException w:name="List Continue" w:semiHidden="1" w:unhideWhenUsed="1"/>
@@ -1475,8 +2369,8 @@
     <w:lsdException w:name="Subtle Reference" w:uiPriority="31" w:qFormat="1"/>
     <w:lsdException w:name="Intense Reference" w:uiPriority="32" w:qFormat="1"/>
     <w:lsdException w:name="Book Title" w:uiPriority="33" w:qFormat="1"/>
-    <w:lsdException w:name="Bibliography" w:uiPriority="37" w:semiHidden="1" w:unhideWhenUsed="1"/>
-    <w:lsdException w:name="TOC Heading" w:uiPriority="39" w:semiHidden="1" w:unhideWhenUsed="1" w:qFormat="1"/>
+    <w:lsdException w:name="Bibliography" w:semiHidden="1" w:uiPriority="37" w:unhideWhenUsed="1"/>
+    <w:lsdException w:name="TOC Heading" w:semiHidden="1" w:uiPriority="39" w:unhideWhenUsed="1" w:qFormat="1"/>
     <w:lsdException w:name="Plain Table 1" w:uiPriority="41"/>
     <w:lsdException w:name="Plain Table 2" w:uiPriority="42"/>
     <w:lsdException w:name="Plain Table 3" w:uiPriority="43"/>
@@ -1587,7 +2481,7 @@
     <w:lsdException w:name="Unresolved Mention" w:semiHidden="1" w:unhideWhenUsed="1"/>
     <w:lsdException w:name="Smart Link" w:semiHidden="1" w:unhideWhenUsed="1"/>
   </w:latentStyles>
-  <w:style w:type="paragraph" w:styleId="Normal" w:default="1">
+  <w:style w:type="paragraph" w:default="1" w:styleId="Normal">
     <w:name w:val="Normal"/>
     <w:qFormat/>
   </w:style>
@@ -1605,7 +2499,7 @@
       <w:outlineLvl w:val="0"/>
     </w:pPr>
     <w:rPr>
-      <w:rFonts w:asciiTheme="majorHAnsi" w:hAnsiTheme="majorHAnsi" w:eastAsiaTheme="majorEastAsia" w:cstheme="majorBidi"/>
+      <w:rFonts w:asciiTheme="majorHAnsi" w:eastAsiaTheme="majorEastAsia" w:hAnsiTheme="majorHAnsi" w:cstheme="majorBidi"/>
       <w:color w:val="0F4761" w:themeColor="accent1" w:themeShade="BF"/>
       <w:sz w:val="40"/>
       <w:szCs w:val="40"/>
@@ -1626,7 +2520,7 @@
       <w:outlineLvl w:val="1"/>
     </w:pPr>
     <w:rPr>
-      <w:rFonts w:asciiTheme="majorHAnsi" w:hAnsiTheme="majorHAnsi" w:eastAsiaTheme="majorEastAsia" w:cstheme="majorBidi"/>
+      <w:rFonts w:asciiTheme="majorHAnsi" w:eastAsiaTheme="majorEastAsia" w:hAnsiTheme="majorHAnsi" w:cstheme="majorBidi"/>
       <w:color w:val="0F4761" w:themeColor="accent1" w:themeShade="BF"/>
       <w:sz w:val="32"/>
       <w:szCs w:val="32"/>
@@ -1773,13 +2667,13 @@
       <w:color w:val="272727" w:themeColor="text1" w:themeTint="D8"/>
     </w:rPr>
   </w:style>
-  <w:style w:type="character" w:styleId="DefaultParagraphFont" w:default="1">
+  <w:style w:type="character" w:default="1" w:styleId="DefaultParagraphFont">
     <w:name w:val="Default Paragraph Font"/>
     <w:uiPriority w:val="1"/>
     <w:semiHidden/>
     <w:unhideWhenUsed/>
   </w:style>
-  <w:style w:type="table" w:styleId="TableNormal" w:default="1">
+  <w:style w:type="table" w:default="1" w:styleId="TableNormal">
     <w:name w:val="Normal Table"/>
     <w:uiPriority w:val="99"/>
     <w:semiHidden/>
@@ -1794,37 +2688,37 @@
       </w:tblCellMar>
     </w:tblPr>
   </w:style>
-  <w:style w:type="numbering" w:styleId="NoList" w:default="1">
+  <w:style w:type="numbering" w:default="1" w:styleId="NoList">
     <w:name w:val="No List"/>
     <w:uiPriority w:val="99"/>
     <w:semiHidden/>
     <w:unhideWhenUsed/>
   </w:style>
-  <w:style w:type="character" w:styleId="Heading1Char" w:customStyle="1">
+  <w:style w:type="character" w:customStyle="1" w:styleId="Heading1Char">
     <w:name w:val="Heading 1 Char"/>
     <w:basedOn w:val="DefaultParagraphFont"/>
     <w:link w:val="Heading1"/>
     <w:uiPriority w:val="9"/>
     <w:rPr>
-      <w:rFonts w:asciiTheme="majorHAnsi" w:hAnsiTheme="majorHAnsi" w:eastAsiaTheme="majorEastAsia" w:cstheme="majorBidi"/>
+      <w:rFonts w:asciiTheme="majorHAnsi" w:eastAsiaTheme="majorEastAsia" w:hAnsiTheme="majorHAnsi" w:cstheme="majorBidi"/>
       <w:color w:val="0F4761" w:themeColor="accent1" w:themeShade="BF"/>
       <w:sz w:val="40"/>
       <w:szCs w:val="40"/>
     </w:rPr>
   </w:style>
-  <w:style w:type="character" w:styleId="Heading2Char" w:customStyle="1">
+  <w:style w:type="character" w:customStyle="1" w:styleId="Heading2Char">
     <w:name w:val="Heading 2 Char"/>
     <w:basedOn w:val="DefaultParagraphFont"/>
     <w:link w:val="Heading2"/>
     <w:uiPriority w:val="9"/>
     <w:rPr>
-      <w:rFonts w:asciiTheme="majorHAnsi" w:hAnsiTheme="majorHAnsi" w:eastAsiaTheme="majorEastAsia" w:cstheme="majorBidi"/>
+      <w:rFonts w:asciiTheme="majorHAnsi" w:eastAsiaTheme="majorEastAsia" w:hAnsiTheme="majorHAnsi" w:cstheme="majorBidi"/>
       <w:color w:val="0F4761" w:themeColor="accent1" w:themeShade="BF"/>
       <w:sz w:val="32"/>
       <w:szCs w:val="32"/>
     </w:rPr>
   </w:style>
-  <w:style w:type="character" w:styleId="Heading3Char" w:customStyle="1">
+  <w:style w:type="character" w:customStyle="1" w:styleId="Heading3Char">
     <w:name w:val="Heading 3 Char"/>
     <w:basedOn w:val="DefaultParagraphFont"/>
     <w:link w:val="Heading3"/>
@@ -1836,7 +2730,7 @@
       <w:szCs w:val="28"/>
     </w:rPr>
   </w:style>
-  <w:style w:type="character" w:styleId="Heading4Char" w:customStyle="1">
+  <w:style w:type="character" w:customStyle="1" w:styleId="Heading4Char">
     <w:name w:val="Heading 4 Char"/>
     <w:basedOn w:val="DefaultParagraphFont"/>
     <w:link w:val="Heading4"/>
@@ -1848,7 +2742,7 @@
       <w:color w:val="0F4761" w:themeColor="accent1" w:themeShade="BF"/>
     </w:rPr>
   </w:style>
-  <w:style w:type="character" w:styleId="Heading5Char" w:customStyle="1">
+  <w:style w:type="character" w:customStyle="1" w:styleId="Heading5Char">
     <w:name w:val="Heading 5 Char"/>
     <w:basedOn w:val="DefaultParagraphFont"/>
     <w:link w:val="Heading5"/>
@@ -1858,7 +2752,7 @@
       <w:color w:val="0F4761" w:themeColor="accent1" w:themeShade="BF"/>
     </w:rPr>
   </w:style>
-  <w:style w:type="character" w:styleId="Heading6Char" w:customStyle="1">
+  <w:style w:type="character" w:customStyle="1" w:styleId="Heading6Char">
     <w:name w:val="Heading 6 Char"/>
     <w:basedOn w:val="DefaultParagraphFont"/>
     <w:link w:val="Heading6"/>
@@ -1870,7 +2764,7 @@
       <w:color w:val="595959" w:themeColor="text1" w:themeTint="A6"/>
     </w:rPr>
   </w:style>
-  <w:style w:type="character" w:styleId="Heading7Char" w:customStyle="1">
+  <w:style w:type="character" w:customStyle="1" w:styleId="Heading7Char">
     <w:name w:val="Heading 7 Char"/>
     <w:basedOn w:val="DefaultParagraphFont"/>
     <w:link w:val="Heading7"/>
@@ -1880,7 +2774,7 @@
       <w:color w:val="595959" w:themeColor="text1" w:themeTint="A6"/>
     </w:rPr>
   </w:style>
-  <w:style w:type="character" w:styleId="Heading8Char" w:customStyle="1">
+  <w:style w:type="character" w:customStyle="1" w:styleId="Heading8Char">
     <w:name w:val="Heading 8 Char"/>
     <w:basedOn w:val="DefaultParagraphFont"/>
     <w:link w:val="Heading8"/>
@@ -1892,7 +2786,7 @@
       <w:color w:val="272727" w:themeColor="text1" w:themeTint="D8"/>
     </w:rPr>
   </w:style>
-  <w:style w:type="character" w:styleId="Heading9Char" w:customStyle="1">
+  <w:style w:type="character" w:customStyle="1" w:styleId="Heading9Char">
     <w:name w:val="Heading 9 Char"/>
     <w:basedOn w:val="DefaultParagraphFont"/>
     <w:link w:val="Heading9"/>
@@ -1902,13 +2796,13 @@
       <w:color w:val="272727" w:themeColor="text1" w:themeTint="D8"/>
     </w:rPr>
   </w:style>
-  <w:style w:type="character" w:styleId="TitleChar" w:customStyle="1">
+  <w:style w:type="character" w:customStyle="1" w:styleId="TitleChar">
     <w:name w:val="Title Char"/>
     <w:basedOn w:val="DefaultParagraphFont"/>
     <w:link w:val="Title"/>
     <w:uiPriority w:val="10"/>
     <w:rPr>
-      <w:rFonts w:asciiTheme="majorHAnsi" w:hAnsiTheme="majorHAnsi" w:eastAsiaTheme="majorEastAsia" w:cstheme="majorBidi"/>
+      <w:rFonts w:asciiTheme="majorHAnsi" w:eastAsiaTheme="majorEastAsia" w:hAnsiTheme="majorHAnsi" w:cstheme="majorBidi"/>
       <w:spacing w:val="-10"/>
       <w:kern w:val="28"/>
       <w:sz w:val="56"/>
@@ -1927,14 +2821,14 @@
       <w:contextualSpacing/>
     </w:pPr>
     <w:rPr>
-      <w:rFonts w:asciiTheme="majorHAnsi" w:hAnsiTheme="majorHAnsi" w:eastAsiaTheme="majorEastAsia" w:cstheme="majorBidi"/>
+      <w:rFonts w:asciiTheme="majorHAnsi" w:eastAsiaTheme="majorEastAsia" w:hAnsiTheme="majorHAnsi" w:cstheme="majorBidi"/>
       <w:spacing w:val="-10"/>
       <w:kern w:val="28"/>
       <w:sz w:val="56"/>
       <w:szCs w:val="56"/>
     </w:rPr>
   </w:style>
-  <w:style w:type="character" w:styleId="SubtitleChar" w:customStyle="1">
+  <w:style w:type="character" w:customStyle="1" w:styleId="SubtitleChar">
     <w:name w:val="Subtitle Char"/>
     <w:basedOn w:val="DefaultParagraphFont"/>
     <w:link w:val="Subtitle"/>
@@ -1978,7 +2872,7 @@
       <w:color w:val="0F4761" w:themeColor="accent1" w:themeShade="BF"/>
     </w:rPr>
   </w:style>
-  <w:style w:type="character" w:styleId="QuoteChar" w:customStyle="1">
+  <w:style w:type="character" w:customStyle="1" w:styleId="QuoteChar">
     <w:name w:val="Quote Char"/>
     <w:basedOn w:val="DefaultParagraphFont"/>
     <w:link w:val="Quote"/>
@@ -2006,7 +2900,7 @@
       <w:color w:val="404040" w:themeColor="text1" w:themeTint="BF"/>
     </w:rPr>
   </w:style>
-  <w:style w:type="character" w:styleId="IntenseQuoteChar" w:customStyle="1">
+  <w:style w:type="character" w:customStyle="1" w:styleId="IntenseQuoteChar">
     <w:name w:val="Intense Quote Char"/>
     <w:basedOn w:val="DefaultParagraphFont"/>
     <w:link w:val="IntenseQuote"/>
@@ -2026,8 +2920,8 @@
     <w:qFormat/>
     <w:pPr>
       <w:pBdr>
-        <w:top w:val="single" w:color="0F4761" w:themeColor="accent1" w:themeShade="BF" w:sz="4" w:space="10"/>
-        <w:bottom w:val="single" w:color="0F4761" w:themeColor="accent1" w:themeShade="BF" w:sz="4" w:space="10"/>
+        <w:top w:val="single" w:sz="4" w:space="10" w:color="0F4761" w:themeColor="accent1" w:themeShade="BF"/>
+        <w:bottom w:val="single" w:sz="4" w:space="10" w:color="0F4761" w:themeColor="accent1" w:themeShade="BF"/>
       </w:pBdr>
       <w:spacing w:before="360" w:after="360"/>
       <w:ind w:left="864" w:right="864"/>
@@ -2084,20 +2978,57 @@
     </w:pPr>
     <w:tblPr>
       <w:tblBorders>
-        <w:top w:val="single" w:color="000000" w:themeColor="text1" w:sz="4" w:space="0"/>
-        <w:left w:val="single" w:color="000000" w:themeColor="text1" w:sz="4" w:space="0"/>
-        <w:bottom w:val="single" w:color="000000" w:themeColor="text1" w:sz="4" w:space="0"/>
-        <w:right w:val="single" w:color="000000" w:themeColor="text1" w:sz="4" w:space="0"/>
-        <w:insideH w:val="single" w:color="000000" w:themeColor="text1" w:sz="4" w:space="0"/>
-        <w:insideV w:val="single" w:color="000000" w:themeColor="text1" w:sz="4" w:space="0"/>
+        <w:top w:val="single" w:sz="4" w:space="0" w:color="000000" w:themeColor="text1"/>
+        <w:left w:val="single" w:sz="4" w:space="0" w:color="000000" w:themeColor="text1"/>
+        <w:bottom w:val="single" w:sz="4" w:space="0" w:color="000000" w:themeColor="text1"/>
+        <w:right w:val="single" w:sz="4" w:space="0" w:color="000000" w:themeColor="text1"/>
+        <w:insideH w:val="single" w:sz="4" w:space="0" w:color="000000" w:themeColor="text1"/>
+        <w:insideV w:val="single" w:sz="4" w:space="0" w:color="000000" w:themeColor="text1"/>
       </w:tblBorders>
     </w:tblPr>
+  </w:style>
+  <w:style w:type="paragraph" w:styleId="NormalWeb">
+    <w:name w:val="Normal (Web)"/>
+    <w:basedOn w:val="Normal"/>
+    <w:uiPriority w:val="99"/>
+    <w:semiHidden/>
+    <w:unhideWhenUsed/>
+    <w:rsid w:val="0064790E"/>
+    <w:pPr>
+      <w:spacing w:before="100" w:beforeAutospacing="1" w:after="100" w:afterAutospacing="1" w:line="240" w:lineRule="auto"/>
+    </w:pPr>
+    <w:rPr>
+      <w:rFonts w:ascii="Times New Roman" w:eastAsia="Times New Roman" w:hAnsi="Times New Roman" w:cs="Times New Roman"/>
+      <w:lang w:val="en-DK" w:eastAsia="zh-CN"/>
+    </w:rPr>
+  </w:style>
+  <w:style w:type="character" w:styleId="Strong">
+    <w:name w:val="Strong"/>
+    <w:basedOn w:val="DefaultParagraphFont"/>
+    <w:uiPriority w:val="22"/>
+    <w:qFormat/>
+    <w:rsid w:val="0064790E"/>
+    <w:rPr>
+      <w:b/>
+      <w:bCs/>
+    </w:rPr>
+  </w:style>
+  <w:style w:type="character" w:styleId="Emphasis">
+    <w:name w:val="Emphasis"/>
+    <w:basedOn w:val="DefaultParagraphFont"/>
+    <w:uiPriority w:val="20"/>
+    <w:qFormat/>
+    <w:rsid w:val="0064790E"/>
+    <w:rPr>
+      <w:i/>
+      <w:iCs/>
+    </w:rPr>
   </w:style>
 </w:styles>
 </file>
 
 <file path=word/theme/theme1.xml><?xml version="1.0" encoding="utf-8"?>
-<a:theme xmlns:a="http://schemas.openxmlformats.org/drawingml/2006/main" xmlns:thm15="http://schemas.microsoft.com/office/thememl/2012/main" name="Office Theme">
+<a:theme xmlns:a="http://schemas.openxmlformats.org/drawingml/2006/main" name="Office Theme">
   <a:themeElements>
     <a:clrScheme name="Office">
       <a:dk1>
@@ -2528,5 +3459,19 @@
 </file>
 
 <file path=customXml/itemProps3.xml><?xml version="1.0" encoding="utf-8"?>
-<ds:datastoreItem xmlns:ds="http://schemas.openxmlformats.org/officeDocument/2006/customXml" ds:itemID="{26F81569-9316-4B86-B6BE-F9176835DDBA}"/>
+<ds:datastoreItem xmlns:ds="http://schemas.openxmlformats.org/officeDocument/2006/customXml" ds:itemID="{26F81569-9316-4B86-B6BE-F9176835DDBA}">
+  <ds:schemaRefs>
+    <ds:schemaRef ds:uri="http://schemas.microsoft.com/office/2006/metadata/contentType"/>
+    <ds:schemaRef ds:uri="http://schemas.microsoft.com/office/2006/metadata/properties/metaAttributes"/>
+    <ds:schemaRef ds:uri="http://www.w3.org/2001/XMLSchema"/>
+    <ds:schemaRef ds:uri="http://schemas.microsoft.com/office/2006/metadata/properties"/>
+    <ds:schemaRef ds:uri="fb0221c7-f201-482a-b7ac-f35d1bc34810"/>
+    <ds:schemaRef ds:uri="http://schemas.microsoft.com/office/2006/documentManagement/types"/>
+    <ds:schemaRef ds:uri="http://schemas.microsoft.com/office/infopath/2007/PartnerControls"/>
+    <ds:schemaRef ds:uri="http://schemas.openxmlformats.org/package/2006/metadata/core-properties"/>
+    <ds:schemaRef ds:uri="http://purl.org/dc/elements/1.1/"/>
+    <ds:schemaRef ds:uri="http://purl.org/dc/terms/"/>
+    <ds:schemaRef ds:uri="http://schemas.microsoft.com/internal/obd"/>
+  </ds:schemaRefs>
+</ds:datastoreItem>
 </file>
</xml_diff>